<commit_message>
Release 11.2.2: secure evidence sync and modular backend
</commit_message>
<xml_diff>
--- a/backend/templates/programacion_anual.docx
+++ b/backend/templates/programacion_anual.docx
@@ -3,6 +3,9 @@
 <w:document xmlns:wpc="http://schemas.microsoft.com/office/word/2010/wordprocessingCanvas" xmlns:cx="http://schemas.microsoft.com/office/drawing/2014/chartex" xmlns:cx1="http://schemas.microsoft.com/office/drawing/2015/9/8/chartex" xmlns:cx2="http://schemas.microsoft.com/office/drawing/2015/10/21/chartex" xmlns:cx3="http://schemas.microsoft.com/office/drawing/2016/5/9/chartex" xmlns:cx4="http://schemas.microsoft.com/office/drawing/2016/5/10/chartex" xmlns:cx5="http://schemas.microsoft.com/office/drawing/2016/5/11/chartex" xmlns:cx6="http://schemas.microsoft.com/office/drawing/2016/5/12/chartex" xmlns:cx7="http://schemas.microsoft.com/office/drawing/2016/5/13/chartex" xmlns:cx8="http://schemas.microsoft.com/office/drawing/2016/5/14/chartex" xmlns:mc="http://schemas.openxmlformats.org/markup-compatibility/2006" xmlns:aink="http://schemas.microsoft.com/office/drawing/2016/ink" xmlns:am3d="http://schemas.microsoft.com/office/drawing/2017/model3d" xmlns:o="urn:schemas-microsoft-com:office:office" xmlns:r="http://schemas.openxmlformats.org/officeDocument/2006/relationships" xmlns:m="http://schemas.openxmlformats.org/officeDocument/2006/math" xmlns:v="urn:schemas-microsoft-com:vml" xmlns:wp14="http://schemas.microsoft.com/office/word/2010/wordprocessingDrawing" xmlns:wp="http://schemas.openxmlformats.org/drawingml/2006/wordprocessingDrawing" xmlns:w10="urn:schemas-microsoft-com:office:word" xmlns:w="http://schemas.openxmlformats.org/wordprocessingml/2006/main" xmlns:w14="http://schemas.microsoft.com/office/word/2010/wordml" xmlns:w15="http://schemas.microsoft.com/office/word/2012/wordml" xmlns:w16cex="http://schemas.microsoft.com/office/word/2018/wordml/cex" xmlns:w16cid="http://schemas.microsoft.com/office/word/2016/wordml/cid" xmlns:w16="http://schemas.microsoft.com/office/word/2018/wordml" xmlns:w16sdtdh="http://schemas.microsoft.com/office/word/2020/wordml/sdtdatahash" xmlns:w16se="http://schemas.microsoft.com/office/word/2015/wordml/symex" xmlns:wpg="http://schemas.microsoft.com/office/word/2010/wordprocessingGroup" xmlns:wpi="http://schemas.microsoft.com/office/word/2010/wordprocessingInk" xmlns:wne="http://schemas.microsoft.com/office/word/2006/wordml" xmlns:wps="http://schemas.microsoft.com/office/word/2010/wordprocessingShape" mc:Ignorable="w14 w15 w16se w16cid w16 w16cex w16sdtdh wp14">
   <w:body>
     <w:p>
+      <w:pPr>
+        <w:widowControl w:val="0"/>
+      </w:pPr>
       <w:r>
         <w:rPr>
           <w:noProof/>
@@ -602,19 +605,70 @@
         </mc:AlternateContent>
       </w:r>
     </w:p>
-    <w:p/>
-    <w:p/>
-    <w:p/>
-    <w:p/>
-    <w:p/>
-    <w:p/>
-    <w:p/>
-    <w:p/>
-    <w:p/>
-    <w:p/>
-    <w:p/>
-    <w:p/>
     <w:p>
+      <w:pPr>
+        <w:widowControl w:val="0"/>
+      </w:pPr>
+    </w:p>
+    <w:p>
+      <w:pPr>
+        <w:widowControl w:val="0"/>
+      </w:pPr>
+    </w:p>
+    <w:p>
+      <w:pPr>
+        <w:widowControl w:val="0"/>
+      </w:pPr>
+    </w:p>
+    <w:p>
+      <w:pPr>
+        <w:widowControl w:val="0"/>
+      </w:pPr>
+    </w:p>
+    <w:p>
+      <w:pPr>
+        <w:widowControl w:val="0"/>
+      </w:pPr>
+    </w:p>
+    <w:p>
+      <w:pPr>
+        <w:widowControl w:val="0"/>
+      </w:pPr>
+    </w:p>
+    <w:p>
+      <w:pPr>
+        <w:widowControl w:val="0"/>
+      </w:pPr>
+    </w:p>
+    <w:p>
+      <w:pPr>
+        <w:widowControl w:val="0"/>
+      </w:pPr>
+    </w:p>
+    <w:p>
+      <w:pPr>
+        <w:widowControl w:val="0"/>
+      </w:pPr>
+    </w:p>
+    <w:p>
+      <w:pPr>
+        <w:widowControl w:val="0"/>
+      </w:pPr>
+    </w:p>
+    <w:p>
+      <w:pPr>
+        <w:widowControl w:val="0"/>
+      </w:pPr>
+    </w:p>
+    <w:p>
+      <w:pPr>
+        <w:widowControl w:val="0"/>
+      </w:pPr>
+    </w:p>
+    <w:p>
+      <w:pPr>
+        <w:widowControl w:val="0"/>
+      </w:pPr>
       <w:r>
         <w:rPr>
           <w:noProof/>
@@ -685,107 +739,162 @@
         </w:drawing>
       </w:r>
     </w:p>
-    <w:p/>
-    <w:p/>
-    <w:p/>
-    <w:p/>
-    <w:p/>
-    <w:p/>
-    <w:p/>
-    <w:p/>
-    <w:p/>
     <w:p>
       <w:pPr>
+        <w:widowControl w:val="0"/>
+      </w:pPr>
+    </w:p>
+    <w:p>
+      <w:pPr>
+        <w:widowControl w:val="0"/>
+      </w:pPr>
+    </w:p>
+    <w:p>
+      <w:pPr>
+        <w:widowControl w:val="0"/>
+      </w:pPr>
+    </w:p>
+    <w:p>
+      <w:pPr>
+        <w:widowControl w:val="0"/>
+      </w:pPr>
+    </w:p>
+    <w:p>
+      <w:pPr>
+        <w:widowControl w:val="0"/>
+      </w:pPr>
+    </w:p>
+    <w:p>
+      <w:pPr>
+        <w:widowControl w:val="0"/>
+      </w:pPr>
+    </w:p>
+    <w:p>
+      <w:pPr>
+        <w:widowControl w:val="0"/>
+      </w:pPr>
+    </w:p>
+    <w:p>
+      <w:pPr>
+        <w:widowControl w:val="0"/>
+      </w:pPr>
+    </w:p>
+    <w:p>
+      <w:pPr>
+        <w:widowControl w:val="0"/>
+      </w:pPr>
+    </w:p>
+    <w:p>
+      <w:pPr>
+        <w:widowControl w:val="0"/>
         <w:jc w:val="center"/>
       </w:pPr>
     </w:p>
     <w:p>
       <w:pPr>
+        <w:widowControl w:val="0"/>
         <w:jc w:val="center"/>
       </w:pPr>
     </w:p>
     <w:p>
       <w:pPr>
+        <w:widowControl w:val="0"/>
         <w:jc w:val="center"/>
       </w:pPr>
     </w:p>
     <w:p>
       <w:pPr>
+        <w:widowControl w:val="0"/>
         <w:jc w:val="center"/>
       </w:pPr>
     </w:p>
     <w:p>
       <w:pPr>
+        <w:widowControl w:val="0"/>
         <w:jc w:val="center"/>
       </w:pPr>
     </w:p>
     <w:p>
       <w:pPr>
+        <w:widowControl w:val="0"/>
         <w:jc w:val="center"/>
       </w:pPr>
     </w:p>
     <w:p>
       <w:pPr>
+        <w:widowControl w:val="0"/>
         <w:jc w:val="center"/>
       </w:pPr>
     </w:p>
     <w:p>
       <w:pPr>
+        <w:widowControl w:val="0"/>
         <w:jc w:val="center"/>
       </w:pPr>
     </w:p>
     <w:p>
       <w:pPr>
+        <w:widowControl w:val="0"/>
         <w:jc w:val="center"/>
       </w:pPr>
     </w:p>
     <w:p>
       <w:pPr>
+        <w:widowControl w:val="0"/>
         <w:jc w:val="center"/>
       </w:pPr>
     </w:p>
     <w:p>
       <w:pPr>
+        <w:widowControl w:val="0"/>
         <w:jc w:val="center"/>
       </w:pPr>
     </w:p>
     <w:p>
       <w:pPr>
+        <w:widowControl w:val="0"/>
         <w:jc w:val="center"/>
       </w:pPr>
     </w:p>
     <w:p>
       <w:pPr>
+        <w:widowControl w:val="0"/>
         <w:jc w:val="center"/>
       </w:pPr>
     </w:p>
     <w:p>
       <w:pPr>
+        <w:widowControl w:val="0"/>
         <w:jc w:val="center"/>
       </w:pPr>
     </w:p>
     <w:p>
       <w:pPr>
+        <w:widowControl w:val="0"/>
         <w:jc w:val="center"/>
       </w:pPr>
     </w:p>
     <w:p>
       <w:pPr>
+        <w:widowControl w:val="0"/>
         <w:jc w:val="center"/>
       </w:pPr>
     </w:p>
     <w:p>
       <w:pPr>
+        <w:widowControl w:val="0"/>
         <w:jc w:val="center"/>
       </w:pPr>
     </w:p>
     <w:p>
       <w:pPr>
+        <w:widowControl w:val="0"/>
         <w:jc w:val="center"/>
       </w:pPr>
     </w:p>
     <w:p>
       <w:pPr>
+        <w:widowControl w:val="0"/>
         <w:jc w:val="center"/>
       </w:pPr>
       <w:r>
@@ -961,6 +1070,7 @@
     </w:p>
     <w:p>
       <w:pPr>
+        <w:widowControl w:val="0"/>
         <w:jc w:val="center"/>
       </w:pPr>
       <w:r>
@@ -1034,41 +1144,49 @@
     </w:p>
     <w:p>
       <w:pPr>
+        <w:widowControl w:val="0"/>
         <w:jc w:val="center"/>
       </w:pPr>
     </w:p>
     <w:p>
       <w:pPr>
+        <w:widowControl w:val="0"/>
         <w:jc w:val="center"/>
       </w:pPr>
     </w:p>
     <w:p>
       <w:pPr>
+        <w:widowControl w:val="0"/>
         <w:jc w:val="center"/>
       </w:pPr>
     </w:p>
     <w:p>
       <w:pPr>
+        <w:widowControl w:val="0"/>
         <w:jc w:val="center"/>
       </w:pPr>
     </w:p>
     <w:p>
       <w:pPr>
+        <w:widowControl w:val="0"/>
         <w:jc w:val="center"/>
       </w:pPr>
     </w:p>
     <w:p>
       <w:pPr>
+        <w:widowControl w:val="0"/>
         <w:jc w:val="center"/>
       </w:pPr>
     </w:p>
     <w:p>
       <w:pPr>
+        <w:widowControl w:val="0"/>
         <w:jc w:val="center"/>
       </w:pPr>
     </w:p>
     <w:p>
       <w:pPr>
+        <w:widowControl w:val="0"/>
         <w:sectPr>
           <w:headerReference w:type="default" r:id="rId10"/>
           <w:footerReference w:type="default" r:id="rId11"/>
@@ -1081,6 +1199,7 @@
     </w:p>
     <w:p>
       <w:pPr>
+        <w:widowControl w:val="0"/>
         <w:jc w:val="center"/>
         <w:rPr>
           <w:rFonts w:ascii="Times New Roman" w:hAnsi="Times New Roman" w:cs="Times New Roman"/>
@@ -1159,6 +1278,7 @@
     </w:p>
     <w:p>
       <w:pPr>
+        <w:widowControl w:val="0"/>
         <w:jc w:val="center"/>
         <w:rPr>
           <w:rFonts w:ascii="Times New Roman" w:hAnsi="Times New Roman" w:cs="Times New Roman"/>
@@ -1173,6 +1293,7 @@
     </w:p>
     <w:p>
       <w:pPr>
+        <w:widowControl w:val="0"/>
         <w:jc w:val="center"/>
         <w:rPr>
           <w:rFonts w:ascii="Cooper Black" w:hAnsi="Cooper Black"/>
@@ -1217,6 +1338,7 @@
     </w:p>
     <w:p>
       <w:pPr>
+        <w:widowControl w:val="0"/>
         <w:jc w:val="center"/>
         <w:rPr>
           <w:rFonts w:ascii="Cooper Black" w:hAnsi="Cooper Black"/>
@@ -1230,6 +1352,7 @@
     <w:p>
       <w:pPr>
         <w:pStyle w:val="Prrafodelista"/>
+        <w:widowControl w:val="0"/>
         <w:numPr>
           <w:ilvl w:val="0"/>
           <w:numId w:val="1"/>
@@ -1300,6 +1423,7 @@
           <w:p>
             <w:pPr>
               <w:pStyle w:val="Prrafodelista"/>
+              <w:widowControl w:val="0"/>
               <w:spacing w:after="0" w:line="240" w:lineRule="auto"/>
               <w:ind w:left="0"/>
               <w:rPr>
@@ -1330,6 +1454,7 @@
           <w:p>
             <w:pPr>
               <w:pStyle w:val="Prrafodelista"/>
+              <w:widowControl w:val="0"/>
               <w:spacing w:after="0" w:line="240" w:lineRule="auto"/>
               <w:ind w:left="0"/>
               <w:rPr>
@@ -1362,6 +1487,7 @@
           <w:p>
             <w:pPr>
               <w:pStyle w:val="Prrafodelista"/>
+              <w:widowControl w:val="0"/>
               <w:spacing w:after="0" w:line="240" w:lineRule="auto"/>
               <w:ind w:left="0"/>
               <w:rPr>
@@ -1392,6 +1518,7 @@
           <w:p>
             <w:pPr>
               <w:pStyle w:val="Prrafodelista"/>
+              <w:widowControl w:val="0"/>
               <w:spacing w:after="0" w:line="240" w:lineRule="auto"/>
               <w:ind w:left="0"/>
               <w:rPr>
@@ -1453,6 +1580,7 @@
           <w:p>
             <w:pPr>
               <w:pStyle w:val="Prrafodelista"/>
+              <w:widowControl w:val="0"/>
               <w:spacing w:after="0" w:line="240" w:lineRule="auto"/>
               <w:ind w:left="0"/>
               <w:rPr>
@@ -1483,6 +1611,7 @@
           <w:p>
             <w:pPr>
               <w:pStyle w:val="Prrafodelista"/>
+              <w:widowControl w:val="0"/>
               <w:spacing w:after="0" w:line="240" w:lineRule="auto"/>
               <w:ind w:left="0"/>
               <w:rPr>
@@ -1539,6 +1668,7 @@
           <w:p>
             <w:pPr>
               <w:pStyle w:val="Prrafodelista"/>
+              <w:widowControl w:val="0"/>
               <w:spacing w:after="0" w:line="240" w:lineRule="auto"/>
               <w:ind w:left="0"/>
               <w:rPr>
@@ -1569,6 +1699,7 @@
           <w:p>
             <w:pPr>
               <w:pStyle w:val="Prrafodelista"/>
+              <w:widowControl w:val="0"/>
               <w:spacing w:after="0" w:line="240" w:lineRule="auto"/>
               <w:ind w:left="0"/>
               <w:rPr>
@@ -1606,6 +1737,7 @@
           <w:p>
             <w:pPr>
               <w:pStyle w:val="Prrafodelista"/>
+              <w:widowControl w:val="0"/>
               <w:spacing w:after="0" w:line="240" w:lineRule="auto"/>
               <w:ind w:left="0"/>
               <w:rPr>
@@ -1634,6 +1766,7 @@
           <w:p>
             <w:pPr>
               <w:pStyle w:val="Prrafodelista"/>
+              <w:widowControl w:val="0"/>
               <w:spacing w:after="0" w:line="240" w:lineRule="auto"/>
               <w:ind w:left="0"/>
               <w:rPr>
@@ -1666,6 +1799,7 @@
           <w:p>
             <w:pPr>
               <w:pStyle w:val="Prrafodelista"/>
+              <w:widowControl w:val="0"/>
               <w:spacing w:after="0" w:line="240" w:lineRule="auto"/>
               <w:ind w:left="0"/>
               <w:rPr>
@@ -1694,6 +1828,7 @@
           <w:p>
             <w:pPr>
               <w:pStyle w:val="Prrafodelista"/>
+              <w:widowControl w:val="0"/>
               <w:spacing w:after="0" w:line="240" w:lineRule="auto"/>
               <w:ind w:left="0"/>
               <w:rPr>
@@ -1731,6 +1866,7 @@
           <w:p>
             <w:pPr>
               <w:pStyle w:val="Prrafodelista"/>
+              <w:widowControl w:val="0"/>
               <w:spacing w:after="0" w:line="240" w:lineRule="auto"/>
               <w:ind w:left="0"/>
               <w:rPr>
@@ -1761,6 +1897,7 @@
           <w:p>
             <w:pPr>
               <w:pStyle w:val="Prrafodelista"/>
+              <w:widowControl w:val="0"/>
               <w:spacing w:after="0" w:line="240" w:lineRule="auto"/>
               <w:ind w:left="0"/>
               <w:rPr>
@@ -1817,6 +1954,7 @@
           <w:p>
             <w:pPr>
               <w:pStyle w:val="Prrafodelista"/>
+              <w:widowControl w:val="0"/>
               <w:spacing w:after="0" w:line="240" w:lineRule="auto"/>
               <w:ind w:left="0"/>
               <w:rPr>
@@ -1845,6 +1983,7 @@
           <w:p>
             <w:pPr>
               <w:pStyle w:val="Prrafodelista"/>
+              <w:widowControl w:val="0"/>
               <w:spacing w:after="0" w:line="240" w:lineRule="auto"/>
               <w:ind w:left="0"/>
               <w:rPr>
@@ -1882,6 +2021,7 @@
           <w:p>
             <w:pPr>
               <w:pStyle w:val="Prrafodelista"/>
+              <w:widowControl w:val="0"/>
               <w:spacing w:after="0" w:line="240" w:lineRule="auto"/>
               <w:ind w:left="0"/>
               <w:rPr>
@@ -1912,6 +2052,7 @@
           <w:p>
             <w:pPr>
               <w:pStyle w:val="Prrafodelista"/>
+              <w:widowControl w:val="0"/>
               <w:spacing w:after="0" w:line="240" w:lineRule="auto"/>
               <w:ind w:left="0"/>
               <w:rPr>
@@ -1944,6 +2085,7 @@
           <w:p>
             <w:pPr>
               <w:pStyle w:val="Prrafodelista"/>
+              <w:widowControl w:val="0"/>
               <w:spacing w:after="0" w:line="240" w:lineRule="auto"/>
               <w:ind w:left="0"/>
               <w:rPr>
@@ -1972,6 +2114,7 @@
           <w:p>
             <w:pPr>
               <w:pStyle w:val="Prrafodelista"/>
+              <w:widowControl w:val="0"/>
               <w:spacing w:after="0" w:line="240" w:lineRule="auto"/>
               <w:ind w:left="0"/>
               <w:rPr>
@@ -2033,6 +2176,7 @@
           <w:p>
             <w:pPr>
               <w:pStyle w:val="Prrafodelista"/>
+              <w:widowControl w:val="0"/>
               <w:spacing w:after="0" w:line="240" w:lineRule="auto"/>
               <w:ind w:left="0"/>
               <w:rPr>
@@ -2062,6 +2206,7 @@
           <w:p>
             <w:pPr>
               <w:pStyle w:val="Prrafodelista"/>
+              <w:widowControl w:val="0"/>
               <w:spacing w:after="0" w:line="240" w:lineRule="auto"/>
               <w:ind w:left="0"/>
               <w:rPr>
@@ -2099,6 +2244,7 @@
           <w:p>
             <w:pPr>
               <w:pStyle w:val="Prrafodelista"/>
+              <w:widowControl w:val="0"/>
               <w:spacing w:after="0" w:line="240" w:lineRule="auto"/>
               <w:ind w:left="0"/>
               <w:rPr>
@@ -2128,6 +2274,7 @@
           <w:p>
             <w:pPr>
               <w:pStyle w:val="Prrafodelista"/>
+              <w:widowControl w:val="0"/>
               <w:spacing w:after="0" w:line="240" w:lineRule="auto"/>
               <w:ind w:left="0"/>
               <w:rPr>
@@ -2189,6 +2336,7 @@
           <w:p>
             <w:pPr>
               <w:pStyle w:val="Prrafodelista"/>
+              <w:widowControl w:val="0"/>
               <w:spacing w:after="0" w:line="240" w:lineRule="auto"/>
               <w:ind w:left="0"/>
               <w:rPr>
@@ -2220,6 +2368,7 @@
           <w:p>
             <w:pPr>
               <w:pStyle w:val="Prrafodelista"/>
+              <w:widowControl w:val="0"/>
               <w:spacing w:after="0" w:line="240" w:lineRule="auto"/>
               <w:ind w:left="0"/>
               <w:rPr>
@@ -2257,6 +2406,7 @@
           <w:p>
             <w:pPr>
               <w:pStyle w:val="Prrafodelista"/>
+              <w:widowControl w:val="0"/>
               <w:spacing w:after="0" w:line="240" w:lineRule="auto"/>
               <w:ind w:left="0"/>
               <w:rPr>
@@ -2286,6 +2436,7 @@
           <w:p>
             <w:pPr>
               <w:pStyle w:val="Prrafodelista"/>
+              <w:widowControl w:val="0"/>
               <w:spacing w:after="0" w:line="240" w:lineRule="auto"/>
               <w:ind w:left="0"/>
               <w:rPr>
@@ -2339,6 +2490,7 @@
     <w:p>
       <w:pPr>
         <w:pStyle w:val="Prrafodelista"/>
+        <w:widowControl w:val="0"/>
         <w:spacing w:after="0" w:line="240" w:lineRule="auto"/>
         <w:ind w:left="142"/>
         <w:rPr>
@@ -2354,6 +2506,7 @@
     <w:p>
       <w:pPr>
         <w:pStyle w:val="Prrafodelista"/>
+        <w:widowControl w:val="0"/>
         <w:numPr>
           <w:ilvl w:val="0"/>
           <w:numId w:val="1"/>
@@ -2386,6 +2539,7 @@
     <w:p>
       <w:pPr>
         <w:pStyle w:val="Prrafodelista"/>
+        <w:widowControl w:val="0"/>
         <w:numPr>
           <w:ilvl w:val="1"/>
           <w:numId w:val="1"/>
@@ -2411,6 +2565,7 @@
     <w:p>
       <w:pPr>
         <w:pStyle w:val="Prrafodelista"/>
+        <w:widowControl w:val="0"/>
         <w:spacing w:after="0"/>
         <w:ind w:left="283" w:firstLine="709"/>
         <w:jc w:val="both"/>
@@ -2462,6 +2617,7 @@
     <w:p>
       <w:pPr>
         <w:pStyle w:val="Prrafodelista"/>
+        <w:widowControl w:val="0"/>
         <w:ind w:left="283" w:firstLine="709"/>
         <w:jc w:val="both"/>
         <w:rPr>
@@ -2477,6 +2633,7 @@
     <w:p>
       <w:pPr>
         <w:pStyle w:val="Prrafodelista"/>
+        <w:widowControl w:val="0"/>
         <w:numPr>
           <w:ilvl w:val="1"/>
           <w:numId w:val="1"/>
@@ -2514,6 +2671,7 @@
     <w:p>
       <w:pPr>
         <w:pStyle w:val="Prrafodelista"/>
+        <w:widowControl w:val="0"/>
         <w:tabs>
           <w:tab w:val="left" w:pos="2127"/>
         </w:tabs>
@@ -2568,6 +2726,7 @@
     <w:p>
       <w:pPr>
         <w:pStyle w:val="Prrafodelista"/>
+        <w:widowControl w:val="0"/>
         <w:tabs>
           <w:tab w:val="left" w:pos="2127"/>
         </w:tabs>
@@ -2586,6 +2745,7 @@
     <w:p>
       <w:pPr>
         <w:pStyle w:val="Prrafodelista"/>
+        <w:widowControl w:val="0"/>
         <w:numPr>
           <w:ilvl w:val="0"/>
           <w:numId w:val="1"/>
@@ -2616,6 +2776,7 @@
     <w:p>
       <w:pPr>
         <w:pStyle w:val="Prrafodelista"/>
+        <w:widowControl w:val="0"/>
         <w:spacing w:after="0"/>
         <w:ind w:left="283" w:firstLine="709"/>
         <w:jc w:val="both"/>
@@ -2667,6 +2828,7 @@
     <w:p>
       <w:pPr>
         <w:pStyle w:val="Prrafodelista"/>
+        <w:widowControl w:val="0"/>
         <w:ind w:left="283" w:firstLine="709"/>
         <w:jc w:val="both"/>
         <w:rPr>
@@ -2682,6 +2844,7 @@
     <w:p>
       <w:pPr>
         <w:pStyle w:val="Prrafodelista"/>
+        <w:widowControl w:val="0"/>
         <w:numPr>
           <w:ilvl w:val="0"/>
           <w:numId w:val="1"/>
@@ -2724,6 +2887,7 @@
     <w:p>
       <w:pPr>
         <w:pStyle w:val="Prrafodelista"/>
+        <w:widowControl w:val="0"/>
         <w:spacing w:after="0"/>
         <w:ind w:left="283" w:firstLine="709"/>
         <w:jc w:val="both"/>
@@ -2775,6 +2939,7 @@
     <w:p>
       <w:pPr>
         <w:pStyle w:val="Prrafodelista"/>
+        <w:widowControl w:val="0"/>
         <w:spacing w:after="0"/>
         <w:ind w:left="283" w:firstLine="709"/>
         <w:jc w:val="both"/>
@@ -2791,6 +2956,7 @@
     <w:p>
       <w:pPr>
         <w:pStyle w:val="Prrafodelista"/>
+        <w:widowControl w:val="0"/>
         <w:numPr>
           <w:ilvl w:val="0"/>
           <w:numId w:val="1"/>
@@ -2820,6 +2986,7 @@
     <w:p>
       <w:pPr>
         <w:pStyle w:val="Prrafodelista"/>
+        <w:widowControl w:val="0"/>
         <w:spacing w:after="0"/>
         <w:ind w:left="142"/>
         <w:rPr>
@@ -2846,6 +3013,7 @@
     <w:p>
       <w:pPr>
         <w:pStyle w:val="Prrafodelista"/>
+        <w:widowControl w:val="0"/>
         <w:numPr>
           <w:ilvl w:val="1"/>
           <w:numId w:val="1"/>
@@ -2940,6 +3108,7 @@
           </w:tcPr>
           <w:p>
             <w:pPr>
+              <w:widowControl w:val="0"/>
               <w:spacing w:before="60" w:after="60"/>
               <w:rPr>
                 <w:rFonts w:ascii="Magic Mushroom" w:hAnsi="Magic Mushroom" w:cs="Times New Roman"/>
@@ -2964,6 +3133,7 @@
           </w:p>
           <w:p>
             <w:pPr>
+              <w:widowControl w:val="0"/>
               <w:spacing w:before="60" w:after="60"/>
               <w:rPr>
                 <w:rFonts w:ascii="Magic Mushroom" w:hAnsi="Magic Mushroom" w:cs="Times New Roman"/>
@@ -3026,6 +3196,7 @@
           </w:tcPr>
           <w:p>
             <w:pPr>
+              <w:widowControl w:val="0"/>
               <w:spacing w:before="60" w:after="60"/>
               <w:jc w:val="center"/>
               <w:rPr>
@@ -3059,6 +3230,7 @@
           </w:tcPr>
           <w:p>
             <w:pPr>
+              <w:widowControl w:val="0"/>
               <w:spacing w:before="60" w:after="60"/>
               <w:jc w:val="center"/>
               <w:cnfStyle w:val="000000100000" w:firstRow="0" w:lastRow="0" w:firstColumn="0" w:lastColumn="0" w:oddVBand="0" w:evenVBand="0" w:oddHBand="1" w:evenHBand="0" w:firstRowFirstColumn="0" w:firstRowLastColumn="0" w:lastRowFirstColumn="0" w:lastRowLastColumn="0"/>
@@ -3128,6 +3300,7 @@
           </w:tcPr>
           <w:p>
             <w:pPr>
+              <w:widowControl w:val="0"/>
               <w:spacing w:before="60" w:after="60"/>
               <w:jc w:val="center"/>
               <w:cnfStyle w:val="000000100000" w:firstRow="0" w:lastRow="0" w:firstColumn="0" w:lastColumn="0" w:oddVBand="0" w:evenVBand="0" w:oddHBand="1" w:evenHBand="0" w:firstRowFirstColumn="0" w:firstRowLastColumn="0" w:lastRowFirstColumn="0" w:lastRowLastColumn="0"/>
@@ -3197,6 +3370,7 @@
           </w:tcPr>
           <w:p>
             <w:pPr>
+              <w:widowControl w:val="0"/>
               <w:spacing w:before="60" w:after="60"/>
               <w:jc w:val="center"/>
               <w:cnfStyle w:val="000000100000" w:firstRow="0" w:lastRow="0" w:firstColumn="0" w:lastColumn="0" w:oddVBand="0" w:evenVBand="0" w:oddHBand="1" w:evenHBand="0" w:firstRowFirstColumn="0" w:firstRowLastColumn="0" w:lastRowFirstColumn="0" w:lastRowLastColumn="0"/>
@@ -3260,6 +3434,7 @@
           </w:tcPr>
           <w:p>
             <w:pPr>
+              <w:widowControl w:val="0"/>
               <w:spacing w:before="60" w:after="60"/>
               <w:jc w:val="center"/>
               <w:rPr>
@@ -3278,6 +3453,7 @@
           </w:tcPr>
           <w:p>
             <w:pPr>
+              <w:widowControl w:val="0"/>
               <w:spacing w:before="60" w:after="60"/>
               <w:jc w:val="center"/>
               <w:cnfStyle w:val="000000000000" w:firstRow="0" w:lastRow="0" w:firstColumn="0" w:lastColumn="0" w:oddVBand="0" w:evenVBand="0" w:oddHBand="0" w:evenHBand="0" w:firstRowFirstColumn="0" w:firstRowLastColumn="0" w:lastRowFirstColumn="0" w:lastRowLastColumn="0"/>
@@ -3310,6 +3486,7 @@
           </w:tcPr>
           <w:p>
             <w:pPr>
+              <w:widowControl w:val="0"/>
               <w:spacing w:before="60" w:after="60"/>
               <w:jc w:val="center"/>
               <w:cnfStyle w:val="000000000000" w:firstRow="0" w:lastRow="0" w:firstColumn="0" w:lastColumn="0" w:oddVBand="0" w:evenVBand="0" w:oddHBand="0" w:evenHBand="0" w:firstRowFirstColumn="0" w:firstRowLastColumn="0" w:lastRowFirstColumn="0" w:lastRowLastColumn="0"/>
@@ -3342,6 +3519,7 @@
           </w:tcPr>
           <w:p>
             <w:pPr>
+              <w:widowControl w:val="0"/>
               <w:spacing w:before="60" w:after="60"/>
               <w:jc w:val="center"/>
               <w:cnfStyle w:val="000000000000" w:firstRow="0" w:lastRow="0" w:firstColumn="0" w:lastColumn="0" w:oddVBand="0" w:evenVBand="0" w:oddHBand="0" w:evenHBand="0" w:firstRowFirstColumn="0" w:firstRowLastColumn="0" w:lastRowFirstColumn="0" w:lastRowLastColumn="0"/>
@@ -3374,6 +3552,7 @@
           </w:tcPr>
           <w:p>
             <w:pPr>
+              <w:widowControl w:val="0"/>
               <w:spacing w:before="60" w:after="60"/>
               <w:jc w:val="center"/>
               <w:cnfStyle w:val="000000000000" w:firstRow="0" w:lastRow="0" w:firstColumn="0" w:lastColumn="0" w:oddVBand="0" w:evenVBand="0" w:oddHBand="0" w:evenHBand="0" w:firstRowFirstColumn="0" w:firstRowLastColumn="0" w:lastRowFirstColumn="0" w:lastRowLastColumn="0"/>
@@ -3406,6 +3585,7 @@
           </w:tcPr>
           <w:p>
             <w:pPr>
+              <w:widowControl w:val="0"/>
               <w:spacing w:before="60" w:after="60"/>
               <w:jc w:val="center"/>
               <w:cnfStyle w:val="000000000000" w:firstRow="0" w:lastRow="0" w:firstColumn="0" w:lastColumn="0" w:oddVBand="0" w:evenVBand="0" w:oddHBand="0" w:evenHBand="0" w:firstRowFirstColumn="0" w:firstRowLastColumn="0" w:lastRowFirstColumn="0" w:lastRowLastColumn="0"/>
@@ -3438,6 +3618,7 @@
           </w:tcPr>
           <w:p>
             <w:pPr>
+              <w:widowControl w:val="0"/>
               <w:spacing w:before="60" w:after="60"/>
               <w:jc w:val="center"/>
               <w:cnfStyle w:val="000000000000" w:firstRow="0" w:lastRow="0" w:firstColumn="0" w:lastColumn="0" w:oddVBand="0" w:evenVBand="0" w:oddHBand="0" w:evenHBand="0" w:firstRowFirstColumn="0" w:firstRowLastColumn="0" w:lastRowFirstColumn="0" w:lastRowLastColumn="0"/>
@@ -3478,6 +3659,7 @@
           </w:tcPr>
           <w:p>
             <w:pPr>
+              <w:widowControl w:val="0"/>
               <w:spacing w:before="60" w:after="60"/>
               <w:jc w:val="center"/>
               <w:rPr>
@@ -3512,6 +3694,7 @@
           </w:tcPr>
           <w:p>
             <w:pPr>
+              <w:widowControl w:val="0"/>
               <w:spacing w:before="60" w:after="60"/>
               <w:jc w:val="center"/>
               <w:cnfStyle w:val="000000100000" w:firstRow="0" w:lastRow="0" w:firstColumn="0" w:lastColumn="0" w:oddVBand="0" w:evenVBand="0" w:oddHBand="1" w:evenHBand="0" w:firstRowFirstColumn="0" w:firstRowLastColumn="0" w:lastRowFirstColumn="0" w:lastRowLastColumn="0"/>
@@ -3573,6 +3756,7 @@
           </w:tcPr>
           <w:p>
             <w:pPr>
+              <w:widowControl w:val="0"/>
               <w:spacing w:before="60" w:after="60"/>
               <w:jc w:val="center"/>
               <w:cnfStyle w:val="000000100000" w:firstRow="0" w:lastRow="0" w:firstColumn="0" w:lastColumn="0" w:oddVBand="0" w:evenVBand="0" w:oddHBand="1" w:evenHBand="0" w:firstRowFirstColumn="0" w:firstRowLastColumn="0" w:lastRowFirstColumn="0" w:lastRowLastColumn="0"/>
@@ -3634,6 +3818,7 @@
           </w:tcPr>
           <w:p>
             <w:pPr>
+              <w:widowControl w:val="0"/>
               <w:spacing w:before="60" w:after="60"/>
               <w:jc w:val="center"/>
               <w:cnfStyle w:val="000000100000" w:firstRow="0" w:lastRow="0" w:firstColumn="0" w:lastColumn="0" w:oddVBand="0" w:evenVBand="0" w:oddHBand="1" w:evenHBand="0" w:firstRowFirstColumn="0" w:firstRowLastColumn="0" w:lastRowFirstColumn="0" w:lastRowLastColumn="0"/>
@@ -3695,6 +3880,7 @@
           </w:tcPr>
           <w:p>
             <w:pPr>
+              <w:widowControl w:val="0"/>
               <w:spacing w:before="60" w:after="60"/>
               <w:jc w:val="center"/>
               <w:cnfStyle w:val="000000100000" w:firstRow="0" w:lastRow="0" w:firstColumn="0" w:lastColumn="0" w:oddVBand="0" w:evenVBand="0" w:oddHBand="1" w:evenHBand="0" w:firstRowFirstColumn="0" w:firstRowLastColumn="0" w:lastRowFirstColumn="0" w:lastRowLastColumn="0"/>
@@ -3756,6 +3942,7 @@
           </w:tcPr>
           <w:p>
             <w:pPr>
+              <w:widowControl w:val="0"/>
               <w:spacing w:before="60" w:after="60"/>
               <w:jc w:val="center"/>
               <w:cnfStyle w:val="000000100000" w:firstRow="0" w:lastRow="0" w:firstColumn="0" w:lastColumn="0" w:oddVBand="0" w:evenVBand="0" w:oddHBand="1" w:evenHBand="0" w:firstRowFirstColumn="0" w:firstRowLastColumn="0" w:lastRowFirstColumn="0" w:lastRowLastColumn="0"/>
@@ -3817,6 +4004,7 @@
           </w:tcPr>
           <w:p>
             <w:pPr>
+              <w:widowControl w:val="0"/>
               <w:spacing w:before="60" w:after="60"/>
               <w:jc w:val="center"/>
               <w:cnfStyle w:val="000000100000" w:firstRow="0" w:lastRow="0" w:firstColumn="0" w:lastColumn="0" w:oddVBand="0" w:evenVBand="0" w:oddHBand="1" w:evenHBand="0" w:firstRowFirstColumn="0" w:firstRowLastColumn="0" w:lastRowFirstColumn="0" w:lastRowLastColumn="0"/>
@@ -3884,6 +4072,7 @@
           </w:tcPr>
           <w:p>
             <w:pPr>
+              <w:widowControl w:val="0"/>
               <w:spacing w:before="60" w:after="60"/>
               <w:jc w:val="center"/>
               <w:rPr>
@@ -3918,6 +4107,7 @@
           </w:tcPr>
           <w:p>
             <w:pPr>
+              <w:widowControl w:val="0"/>
               <w:spacing w:before="60" w:after="60"/>
               <w:jc w:val="center"/>
               <w:cnfStyle w:val="000000000000" w:firstRow="0" w:lastRow="0" w:firstColumn="0" w:lastColumn="0" w:oddVBand="0" w:evenVBand="0" w:oddHBand="0" w:evenHBand="0" w:firstRowFirstColumn="0" w:firstRowLastColumn="0" w:lastRowFirstColumn="0" w:lastRowLastColumn="0"/>
@@ -3979,6 +4169,7 @@
           </w:tcPr>
           <w:p>
             <w:pPr>
+              <w:widowControl w:val="0"/>
               <w:spacing w:before="60" w:after="60"/>
               <w:jc w:val="center"/>
               <w:cnfStyle w:val="000000000000" w:firstRow="0" w:lastRow="0" w:firstColumn="0" w:lastColumn="0" w:oddVBand="0" w:evenVBand="0" w:oddHBand="0" w:evenHBand="0" w:firstRowFirstColumn="0" w:firstRowLastColumn="0" w:lastRowFirstColumn="0" w:lastRowLastColumn="0"/>
@@ -4040,6 +4231,7 @@
           </w:tcPr>
           <w:p>
             <w:pPr>
+              <w:widowControl w:val="0"/>
               <w:spacing w:before="60" w:after="60"/>
               <w:jc w:val="center"/>
               <w:cnfStyle w:val="000000000000" w:firstRow="0" w:lastRow="0" w:firstColumn="0" w:lastColumn="0" w:oddVBand="0" w:evenVBand="0" w:oddHBand="0" w:evenHBand="0" w:firstRowFirstColumn="0" w:firstRowLastColumn="0" w:lastRowFirstColumn="0" w:lastRowLastColumn="0"/>
@@ -4101,6 +4293,7 @@
           </w:tcPr>
           <w:p>
             <w:pPr>
+              <w:widowControl w:val="0"/>
               <w:spacing w:before="60" w:after="60"/>
               <w:jc w:val="center"/>
               <w:cnfStyle w:val="000000000000" w:firstRow="0" w:lastRow="0" w:firstColumn="0" w:lastColumn="0" w:oddVBand="0" w:evenVBand="0" w:oddHBand="0" w:evenHBand="0" w:firstRowFirstColumn="0" w:firstRowLastColumn="0" w:lastRowFirstColumn="0" w:lastRowLastColumn="0"/>
@@ -4162,6 +4355,7 @@
           </w:tcPr>
           <w:p>
             <w:pPr>
+              <w:widowControl w:val="0"/>
               <w:spacing w:before="60" w:after="60"/>
               <w:jc w:val="center"/>
               <w:cnfStyle w:val="000000000000" w:firstRow="0" w:lastRow="0" w:firstColumn="0" w:lastColumn="0" w:oddVBand="0" w:evenVBand="0" w:oddHBand="0" w:evenHBand="0" w:firstRowFirstColumn="0" w:firstRowLastColumn="0" w:lastRowFirstColumn="0" w:lastRowLastColumn="0"/>
@@ -4223,6 +4417,7 @@
           </w:tcPr>
           <w:p>
             <w:pPr>
+              <w:widowControl w:val="0"/>
               <w:spacing w:before="60" w:after="60"/>
               <w:jc w:val="center"/>
               <w:cnfStyle w:val="000000000000" w:firstRow="0" w:lastRow="0" w:firstColumn="0" w:lastColumn="0" w:oddVBand="0" w:evenVBand="0" w:oddHBand="0" w:evenHBand="0" w:firstRowFirstColumn="0" w:firstRowLastColumn="0" w:lastRowFirstColumn="0" w:lastRowLastColumn="0"/>
@@ -4291,6 +4486,7 @@
           </w:tcPr>
           <w:p>
             <w:pPr>
+              <w:widowControl w:val="0"/>
               <w:spacing w:before="60" w:after="60"/>
               <w:jc w:val="center"/>
               <w:rPr>
@@ -4325,6 +4521,7 @@
           </w:tcPr>
           <w:p>
             <w:pPr>
+              <w:widowControl w:val="0"/>
               <w:spacing w:before="60" w:after="60"/>
               <w:jc w:val="center"/>
               <w:cnfStyle w:val="000000100000" w:firstRow="0" w:lastRow="0" w:firstColumn="0" w:lastColumn="0" w:oddVBand="0" w:evenVBand="0" w:oddHBand="1" w:evenHBand="0" w:firstRowFirstColumn="0" w:firstRowLastColumn="0" w:lastRowFirstColumn="0" w:lastRowLastColumn="0"/>
@@ -4386,6 +4583,7 @@
           </w:tcPr>
           <w:p>
             <w:pPr>
+              <w:widowControl w:val="0"/>
               <w:spacing w:before="60" w:after="60"/>
               <w:jc w:val="center"/>
               <w:cnfStyle w:val="000000100000" w:firstRow="0" w:lastRow="0" w:firstColumn="0" w:lastColumn="0" w:oddVBand="0" w:evenVBand="0" w:oddHBand="1" w:evenHBand="0" w:firstRowFirstColumn="0" w:firstRowLastColumn="0" w:lastRowFirstColumn="0" w:lastRowLastColumn="0"/>
@@ -4447,6 +4645,7 @@
           </w:tcPr>
           <w:p>
             <w:pPr>
+              <w:widowControl w:val="0"/>
               <w:spacing w:before="60" w:after="60"/>
               <w:jc w:val="center"/>
               <w:cnfStyle w:val="000000100000" w:firstRow="0" w:lastRow="0" w:firstColumn="0" w:lastColumn="0" w:oddVBand="0" w:evenVBand="0" w:oddHBand="1" w:evenHBand="0" w:firstRowFirstColumn="0" w:firstRowLastColumn="0" w:lastRowFirstColumn="0" w:lastRowLastColumn="0"/>
@@ -4508,6 +4707,7 @@
           </w:tcPr>
           <w:p>
             <w:pPr>
+              <w:widowControl w:val="0"/>
               <w:spacing w:before="60" w:after="60"/>
               <w:jc w:val="center"/>
               <w:cnfStyle w:val="000000100000" w:firstRow="0" w:lastRow="0" w:firstColumn="0" w:lastColumn="0" w:oddVBand="0" w:evenVBand="0" w:oddHBand="1" w:evenHBand="0" w:firstRowFirstColumn="0" w:firstRowLastColumn="0" w:lastRowFirstColumn="0" w:lastRowLastColumn="0"/>
@@ -4569,6 +4769,7 @@
           </w:tcPr>
           <w:p>
             <w:pPr>
+              <w:widowControl w:val="0"/>
               <w:spacing w:before="60" w:after="60"/>
               <w:jc w:val="center"/>
               <w:cnfStyle w:val="000000100000" w:firstRow="0" w:lastRow="0" w:firstColumn="0" w:lastColumn="0" w:oddVBand="0" w:evenVBand="0" w:oddHBand="1" w:evenHBand="0" w:firstRowFirstColumn="0" w:firstRowLastColumn="0" w:lastRowFirstColumn="0" w:lastRowLastColumn="0"/>
@@ -4630,6 +4831,7 @@
           </w:tcPr>
           <w:p>
             <w:pPr>
+              <w:widowControl w:val="0"/>
               <w:spacing w:before="60" w:after="60"/>
               <w:jc w:val="center"/>
               <w:cnfStyle w:val="000000100000" w:firstRow="0" w:lastRow="0" w:firstColumn="0" w:lastColumn="0" w:oddVBand="0" w:evenVBand="0" w:oddHBand="1" w:evenHBand="0" w:firstRowFirstColumn="0" w:firstRowLastColumn="0" w:lastRowFirstColumn="0" w:lastRowLastColumn="0"/>
@@ -4697,6 +4899,7 @@
           </w:tcPr>
           <w:p>
             <w:pPr>
+              <w:widowControl w:val="0"/>
               <w:spacing w:before="60" w:after="60"/>
               <w:jc w:val="center"/>
               <w:rPr>
@@ -4731,6 +4934,7 @@
           </w:tcPr>
           <w:p>
             <w:pPr>
+              <w:widowControl w:val="0"/>
               <w:spacing w:before="60" w:after="60"/>
               <w:jc w:val="center"/>
               <w:cnfStyle w:val="000000000000" w:firstRow="0" w:lastRow="0" w:firstColumn="0" w:lastColumn="0" w:oddVBand="0" w:evenVBand="0" w:oddHBand="0" w:evenHBand="0" w:firstRowFirstColumn="0" w:firstRowLastColumn="0" w:lastRowFirstColumn="0" w:lastRowLastColumn="0"/>
@@ -4792,6 +4996,7 @@
           </w:tcPr>
           <w:p>
             <w:pPr>
+              <w:widowControl w:val="0"/>
               <w:spacing w:before="60" w:after="60"/>
               <w:jc w:val="center"/>
               <w:cnfStyle w:val="000000000000" w:firstRow="0" w:lastRow="0" w:firstColumn="0" w:lastColumn="0" w:oddVBand="0" w:evenVBand="0" w:oddHBand="0" w:evenHBand="0" w:firstRowFirstColumn="0" w:firstRowLastColumn="0" w:lastRowFirstColumn="0" w:lastRowLastColumn="0"/>
@@ -4853,6 +5058,7 @@
           </w:tcPr>
           <w:p>
             <w:pPr>
+              <w:widowControl w:val="0"/>
               <w:spacing w:before="60" w:after="60"/>
               <w:jc w:val="center"/>
               <w:cnfStyle w:val="000000000000" w:firstRow="0" w:lastRow="0" w:firstColumn="0" w:lastColumn="0" w:oddVBand="0" w:evenVBand="0" w:oddHBand="0" w:evenHBand="0" w:firstRowFirstColumn="0" w:firstRowLastColumn="0" w:lastRowFirstColumn="0" w:lastRowLastColumn="0"/>
@@ -4914,6 +5120,7 @@
           </w:tcPr>
           <w:p>
             <w:pPr>
+              <w:widowControl w:val="0"/>
               <w:spacing w:before="60" w:after="60"/>
               <w:jc w:val="center"/>
               <w:cnfStyle w:val="000000000000" w:firstRow="0" w:lastRow="0" w:firstColumn="0" w:lastColumn="0" w:oddVBand="0" w:evenVBand="0" w:oddHBand="0" w:evenHBand="0" w:firstRowFirstColumn="0" w:firstRowLastColumn="0" w:lastRowFirstColumn="0" w:lastRowLastColumn="0"/>
@@ -4975,6 +5182,7 @@
           </w:tcPr>
           <w:p>
             <w:pPr>
+              <w:widowControl w:val="0"/>
               <w:spacing w:before="60" w:after="60"/>
               <w:jc w:val="center"/>
               <w:cnfStyle w:val="000000000000" w:firstRow="0" w:lastRow="0" w:firstColumn="0" w:lastColumn="0" w:oddVBand="0" w:evenVBand="0" w:oddHBand="0" w:evenHBand="0" w:firstRowFirstColumn="0" w:firstRowLastColumn="0" w:lastRowFirstColumn="0" w:lastRowLastColumn="0"/>
@@ -5036,6 +5244,7 @@
           </w:tcPr>
           <w:p>
             <w:pPr>
+              <w:widowControl w:val="0"/>
               <w:spacing w:before="60" w:after="60"/>
               <w:jc w:val="center"/>
               <w:cnfStyle w:val="000000000000" w:firstRow="0" w:lastRow="0" w:firstColumn="0" w:lastColumn="0" w:oddVBand="0" w:evenVBand="0" w:oddHBand="0" w:evenHBand="0" w:firstRowFirstColumn="0" w:firstRowLastColumn="0" w:lastRowFirstColumn="0" w:lastRowLastColumn="0"/>
@@ -5104,6 +5313,7 @@
           </w:tcPr>
           <w:p>
             <w:pPr>
+              <w:widowControl w:val="0"/>
               <w:spacing w:before="60" w:after="60"/>
               <w:jc w:val="center"/>
               <w:rPr>
@@ -5126,7 +5336,6 @@
                 <w:szCs w:val="16"/>
                 <w:lang w:val="es-PE"/>
               </w:rPr>
-              <w:lastRenderedPageBreak/>
               <w:t>No Evaluados</w:t>
             </w:r>
           </w:p>
@@ -5139,6 +5348,7 @@
           </w:tcPr>
           <w:p>
             <w:pPr>
+              <w:widowControl w:val="0"/>
               <w:spacing w:before="60" w:after="60"/>
               <w:jc w:val="center"/>
               <w:cnfStyle w:val="000000100000" w:firstRow="0" w:lastRow="0" w:firstColumn="0" w:lastColumn="0" w:oddVBand="0" w:evenVBand="0" w:oddHBand="1" w:evenHBand="0" w:firstRowFirstColumn="0" w:firstRowLastColumn="0" w:lastRowFirstColumn="0" w:lastRowLastColumn="0"/>
@@ -5200,6 +5410,7 @@
           </w:tcPr>
           <w:p>
             <w:pPr>
+              <w:widowControl w:val="0"/>
               <w:spacing w:before="60" w:after="60"/>
               <w:jc w:val="center"/>
               <w:cnfStyle w:val="000000100000" w:firstRow="0" w:lastRow="0" w:firstColumn="0" w:lastColumn="0" w:oddVBand="0" w:evenVBand="0" w:oddHBand="1" w:evenHBand="0" w:firstRowFirstColumn="0" w:firstRowLastColumn="0" w:lastRowFirstColumn="0" w:lastRowLastColumn="0"/>
@@ -5236,9 +5447,8 @@
                 <w:szCs w:val="16"/>
                 <w:lang w:val="es-PE"/>
               </w:rPr>
-              <w:t>lb_ne_percent</w:t>
-            </w:r>
-            <w:proofErr w:type="spellEnd"/>
+              <w:t>lb_ne_p</w:t>
+            </w:r>
             <w:r>
               <w:rPr>
                 <w:rFonts w:cstheme="minorHAnsi"/>
@@ -5249,6 +5459,20 @@
                 <w:szCs w:val="16"/>
                 <w:lang w:val="es-PE"/>
               </w:rPr>
+              <w:lastRenderedPageBreak/>
+              <w:t>ercent</w:t>
+            </w:r>
+            <w:proofErr w:type="spellEnd"/>
+            <w:r>
+              <w:rPr>
+                <w:rFonts w:cstheme="minorHAnsi"/>
+                <w:b/>
+                <w:bCs/>
+                <w:color w:val="000000" w:themeColor="text1"/>
+                <w:sz w:val="16"/>
+                <w:szCs w:val="16"/>
+                <w:lang w:val="es-PE"/>
+              </w:rPr>
               <w:t>&gt;&gt;</w:t>
             </w:r>
           </w:p>
@@ -5261,6 +5485,7 @@
           </w:tcPr>
           <w:p>
             <w:pPr>
+              <w:widowControl w:val="0"/>
               <w:spacing w:before="60" w:after="60"/>
               <w:jc w:val="center"/>
               <w:cnfStyle w:val="000000100000" w:firstRow="0" w:lastRow="0" w:firstColumn="0" w:lastColumn="0" w:oddVBand="0" w:evenVBand="0" w:oddHBand="1" w:evenHBand="0" w:firstRowFirstColumn="0" w:firstRowLastColumn="0" w:lastRowFirstColumn="0" w:lastRowLastColumn="0"/>
@@ -5284,6 +5509,7 @@
                 <w:szCs w:val="16"/>
                 <w:lang w:val="es-PE"/>
               </w:rPr>
+              <w:lastRenderedPageBreak/>
               <w:t>&lt;&lt;</w:t>
             </w:r>
             <w:proofErr w:type="spellStart"/>
@@ -5322,6 +5548,7 @@
           </w:tcPr>
           <w:p>
             <w:pPr>
+              <w:widowControl w:val="0"/>
               <w:spacing w:before="60" w:after="60"/>
               <w:jc w:val="center"/>
               <w:cnfStyle w:val="000000100000" w:firstRow="0" w:lastRow="0" w:firstColumn="0" w:lastColumn="0" w:oddVBand="0" w:evenVBand="0" w:oddHBand="1" w:evenHBand="0" w:firstRowFirstColumn="0" w:firstRowLastColumn="0" w:lastRowFirstColumn="0" w:lastRowLastColumn="0"/>
@@ -5358,9 +5585,8 @@
                 <w:szCs w:val="16"/>
                 <w:lang w:val="es-PE"/>
               </w:rPr>
-              <w:t>dg_ne_percent</w:t>
-            </w:r>
-            <w:proofErr w:type="spellEnd"/>
+              <w:t>dg_ne_per</w:t>
+            </w:r>
             <w:r>
               <w:rPr>
                 <w:rFonts w:cstheme="minorHAnsi"/>
@@ -5371,6 +5597,20 @@
                 <w:szCs w:val="16"/>
                 <w:lang w:val="es-PE"/>
               </w:rPr>
+              <w:lastRenderedPageBreak/>
+              <w:t>cent</w:t>
+            </w:r>
+            <w:proofErr w:type="spellEnd"/>
+            <w:r>
+              <w:rPr>
+                <w:rFonts w:cstheme="minorHAnsi"/>
+                <w:b/>
+                <w:bCs/>
+                <w:color w:val="000000" w:themeColor="text1"/>
+                <w:sz w:val="16"/>
+                <w:szCs w:val="16"/>
+                <w:lang w:val="es-PE"/>
+              </w:rPr>
               <w:t>&gt;&gt;</w:t>
             </w:r>
           </w:p>
@@ -5383,6 +5623,7 @@
           </w:tcPr>
           <w:p>
             <w:pPr>
+              <w:widowControl w:val="0"/>
               <w:spacing w:before="60" w:after="60"/>
               <w:jc w:val="center"/>
               <w:cnfStyle w:val="000000100000" w:firstRow="0" w:lastRow="0" w:firstColumn="0" w:lastColumn="0" w:oddVBand="0" w:evenVBand="0" w:oddHBand="1" w:evenHBand="0" w:firstRowFirstColumn="0" w:firstRowLastColumn="0" w:lastRowFirstColumn="0" w:lastRowLastColumn="0"/>
@@ -5406,6 +5647,7 @@
                 <w:szCs w:val="16"/>
                 <w:lang w:val="es-PE"/>
               </w:rPr>
+              <w:lastRenderedPageBreak/>
               <w:t>&lt;&lt;</w:t>
             </w:r>
             <w:proofErr w:type="spellStart"/>
@@ -5444,6 +5686,7 @@
           </w:tcPr>
           <w:p>
             <w:pPr>
+              <w:widowControl w:val="0"/>
               <w:spacing w:before="60" w:after="60"/>
               <w:jc w:val="center"/>
               <w:cnfStyle w:val="000000100000" w:firstRow="0" w:lastRow="0" w:firstColumn="0" w:lastColumn="0" w:oddVBand="0" w:evenVBand="0" w:oddHBand="1" w:evenHBand="0" w:firstRowFirstColumn="0" w:firstRowLastColumn="0" w:lastRowFirstColumn="0" w:lastRowLastColumn="0"/>
@@ -5480,7 +5723,20 @@
                 <w:szCs w:val="16"/>
                 <w:lang w:val="es-PE"/>
               </w:rPr>
-              <w:t>mt_ne_percent</w:t>
+              <w:t>mt_ne_per</w:t>
+            </w:r>
+            <w:r>
+              <w:rPr>
+                <w:rFonts w:cstheme="minorHAnsi"/>
+                <w:b/>
+                <w:bCs/>
+                <w:color w:val="000000" w:themeColor="text1"/>
+                <w:sz w:val="16"/>
+                <w:szCs w:val="16"/>
+                <w:lang w:val="es-PE"/>
+              </w:rPr>
+              <w:lastRenderedPageBreak/>
+              <w:t>cent</w:t>
             </w:r>
             <w:proofErr w:type="spellEnd"/>
             <w:r>
@@ -5514,6 +5770,7 @@
           </w:tcPr>
           <w:p>
             <w:pPr>
+              <w:widowControl w:val="0"/>
               <w:spacing w:before="60" w:after="60"/>
               <w:jc w:val="center"/>
               <w:rPr>
@@ -5538,6 +5795,7 @@
                 <w:szCs w:val="16"/>
                 <w:lang w:val="es-PE"/>
               </w:rPr>
+              <w:lastRenderedPageBreak/>
               <w:t>Total</w:t>
             </w:r>
           </w:p>
@@ -5552,6 +5810,7 @@
           </w:tcPr>
           <w:p>
             <w:pPr>
+              <w:widowControl w:val="0"/>
               <w:spacing w:before="60" w:after="60"/>
               <w:jc w:val="center"/>
               <w:cnfStyle w:val="000000000000" w:firstRow="0" w:lastRow="0" w:firstColumn="0" w:lastColumn="0" w:oddVBand="0" w:evenVBand="0" w:oddHBand="0" w:evenHBand="0" w:firstRowFirstColumn="0" w:firstRowLastColumn="0" w:lastRowFirstColumn="0" w:lastRowLastColumn="0"/>
@@ -5587,6 +5846,7 @@
           </w:tcPr>
           <w:p>
             <w:pPr>
+              <w:widowControl w:val="0"/>
               <w:spacing w:before="60" w:after="60"/>
               <w:jc w:val="center"/>
               <w:cnfStyle w:val="000000000000" w:firstRow="0" w:lastRow="0" w:firstColumn="0" w:lastColumn="0" w:oddVBand="0" w:evenVBand="0" w:oddHBand="0" w:evenHBand="0" w:firstRowFirstColumn="0" w:firstRowLastColumn="0" w:lastRowFirstColumn="0" w:lastRowLastColumn="0"/>
@@ -5622,6 +5882,7 @@
           </w:tcPr>
           <w:p>
             <w:pPr>
+              <w:widowControl w:val="0"/>
               <w:spacing w:before="60" w:after="60"/>
               <w:jc w:val="center"/>
               <w:cnfStyle w:val="000000000000" w:firstRow="0" w:lastRow="0" w:firstColumn="0" w:lastColumn="0" w:oddVBand="0" w:evenVBand="0" w:oddHBand="0" w:evenHBand="0" w:firstRowFirstColumn="0" w:firstRowLastColumn="0" w:lastRowFirstColumn="0" w:lastRowLastColumn="0"/>
@@ -5657,6 +5918,7 @@
           </w:tcPr>
           <w:p>
             <w:pPr>
+              <w:widowControl w:val="0"/>
               <w:spacing w:before="60" w:after="60"/>
               <w:jc w:val="center"/>
               <w:cnfStyle w:val="000000000000" w:firstRow="0" w:lastRow="0" w:firstColumn="0" w:lastColumn="0" w:oddVBand="0" w:evenVBand="0" w:oddHBand="0" w:evenHBand="0" w:firstRowFirstColumn="0" w:firstRowLastColumn="0" w:lastRowFirstColumn="0" w:lastRowLastColumn="0"/>
@@ -5716,6 +5978,7 @@
           </w:tcPr>
           <w:p>
             <w:pPr>
+              <w:widowControl w:val="0"/>
               <w:spacing w:before="60" w:after="60"/>
               <w:jc w:val="center"/>
               <w:cnfStyle w:val="000000000000" w:firstRow="0" w:lastRow="0" w:firstColumn="0" w:lastColumn="0" w:oddVBand="0" w:evenVBand="0" w:oddHBand="0" w:evenHBand="0" w:firstRowFirstColumn="0" w:firstRowLastColumn="0" w:lastRowFirstColumn="0" w:lastRowLastColumn="0"/>
@@ -5751,6 +6014,7 @@
           </w:tcPr>
           <w:p>
             <w:pPr>
+              <w:widowControl w:val="0"/>
               <w:spacing w:before="60" w:after="60"/>
               <w:jc w:val="center"/>
               <w:cnfStyle w:val="000000000000" w:firstRow="0" w:lastRow="0" w:firstColumn="0" w:lastColumn="0" w:oddVBand="0" w:evenVBand="0" w:oddHBand="0" w:evenHBand="0" w:firstRowFirstColumn="0" w:firstRowLastColumn="0" w:lastRowFirstColumn="0" w:lastRowLastColumn="0"/>
@@ -5780,6 +6044,7 @@
     </w:tbl>
     <w:p>
       <w:pPr>
+        <w:widowControl w:val="0"/>
         <w:rPr>
           <w:rFonts w:cstheme="minorHAnsi"/>
           <w:b/>
@@ -5803,6 +6068,7 @@
     </w:p>
     <w:p>
       <w:pPr>
+        <w:widowControl w:val="0"/>
         <w:rPr>
           <w:rFonts w:cstheme="minorHAnsi"/>
           <w:b/>
@@ -5850,6 +6116,7 @@
     </w:p>
     <w:p>
       <w:pPr>
+        <w:widowControl w:val="0"/>
         <w:rPr>
           <w:rFonts w:ascii="Calibri" w:hAnsi="Calibri" w:cs="Calibri"/>
           <w:b/>
@@ -5871,6 +6138,7 @@
     <w:p>
       <w:pPr>
         <w:pStyle w:val="Prrafodelista"/>
+        <w:widowControl w:val="0"/>
         <w:numPr>
           <w:ilvl w:val="0"/>
           <w:numId w:val="1"/>
@@ -5902,6 +6170,7 @@
     <w:p>
       <w:pPr>
         <w:pStyle w:val="Prrafodelista"/>
+        <w:widowControl w:val="0"/>
         <w:spacing w:after="0" w:line="240" w:lineRule="auto"/>
         <w:ind w:left="0"/>
         <w:rPr>
@@ -5928,6 +6197,7 @@
     <w:p>
       <w:pPr>
         <w:pStyle w:val="Prrafodelista"/>
+        <w:widowControl w:val="0"/>
         <w:numPr>
           <w:ilvl w:val="1"/>
           <w:numId w:val="1"/>
@@ -6023,6 +6293,7 @@
           </w:tcPr>
           <w:p>
             <w:pPr>
+              <w:widowControl w:val="0"/>
               <w:autoSpaceDE w:val="0"/>
               <w:autoSpaceDN w:val="0"/>
               <w:adjustRightInd w:val="0"/>
@@ -6048,6 +6319,7 @@
           </w:p>
           <w:p>
             <w:pPr>
+              <w:widowControl w:val="0"/>
               <w:autoSpaceDE w:val="0"/>
               <w:autoSpaceDN w:val="0"/>
               <w:adjustRightInd w:val="0"/>
@@ -6083,6 +6355,7 @@
           </w:tcPr>
           <w:p>
             <w:pPr>
+              <w:widowControl w:val="0"/>
               <w:cnfStyle w:val="100000000000" w:firstRow="1" w:lastRow="0" w:firstColumn="0" w:lastColumn="0" w:oddVBand="0" w:evenVBand="0" w:oddHBand="0" w:evenHBand="0" w:firstRowFirstColumn="0" w:firstRowLastColumn="0" w:lastRowFirstColumn="0" w:lastRowLastColumn="0"/>
               <w:rPr>
                 <w:rFonts w:ascii="Magic Mushroom" w:hAnsi="Magic Mushroom" w:cs="Times New Roman"/>
@@ -6144,6 +6417,7 @@
           </w:tcPr>
           <w:p>
             <w:pPr>
+              <w:widowControl w:val="0"/>
               <w:jc w:val="center"/>
               <w:rPr>
                 <w:rFonts w:cstheme="minorHAnsi"/>
@@ -6176,6 +6450,7 @@
           </w:tcPr>
           <w:p>
             <w:pPr>
+              <w:widowControl w:val="0"/>
               <w:jc w:val="center"/>
               <w:cnfStyle w:val="000000100000" w:firstRow="0" w:lastRow="0" w:firstColumn="0" w:lastColumn="0" w:oddVBand="0" w:evenVBand="0" w:oddHBand="1" w:evenHBand="0" w:firstRowFirstColumn="0" w:firstRowLastColumn="0" w:lastRowFirstColumn="0" w:lastRowLastColumn="0"/>
               <w:rPr>
@@ -6212,6 +6487,7 @@
           </w:tcPr>
           <w:p>
             <w:pPr>
+              <w:widowControl w:val="0"/>
               <w:jc w:val="center"/>
               <w:cnfStyle w:val="000000100000" w:firstRow="0" w:lastRow="0" w:firstColumn="0" w:lastColumn="0" w:oddVBand="0" w:evenVBand="0" w:oddHBand="1" w:evenHBand="0" w:firstRowFirstColumn="0" w:firstRowLastColumn="0" w:lastRowFirstColumn="0" w:lastRowLastColumn="0"/>
               <w:rPr>
@@ -6251,6 +6527,7 @@
           </w:tcPr>
           <w:p>
             <w:pPr>
+              <w:widowControl w:val="0"/>
               <w:jc w:val="center"/>
               <w:cnfStyle w:val="000000100000" w:firstRow="0" w:lastRow="0" w:firstColumn="0" w:lastColumn="0" w:oddVBand="0" w:evenVBand="0" w:oddHBand="1" w:evenHBand="0" w:firstRowFirstColumn="0" w:firstRowLastColumn="0" w:lastRowFirstColumn="0" w:lastRowLastColumn="0"/>
               <w:rPr>
@@ -6295,6 +6572,7 @@
           </w:tcPr>
           <w:p>
             <w:pPr>
+              <w:widowControl w:val="0"/>
               <w:rPr>
                 <w:rFonts w:cstheme="minorHAnsi"/>
                 <w:b w:val="0"/>
@@ -6329,6 +6607,7 @@
           </w:tcPr>
           <w:p>
             <w:pPr>
+              <w:widowControl w:val="0"/>
               <w:cnfStyle w:val="000000000000" w:firstRow="0" w:lastRow="0" w:firstColumn="0" w:lastColumn="0" w:oddVBand="0" w:evenVBand="0" w:oddHBand="0" w:evenHBand="0" w:firstRowFirstColumn="0" w:firstRowLastColumn="0" w:lastRowFirstColumn="0" w:lastRowLastColumn="0"/>
               <w:rPr>
                 <w:rFonts w:cstheme="minorHAnsi"/>
@@ -6383,6 +6662,7 @@
           </w:tcPr>
           <w:p>
             <w:pPr>
+              <w:widowControl w:val="0"/>
               <w:cnfStyle w:val="000000000000" w:firstRow="0" w:lastRow="0" w:firstColumn="0" w:lastColumn="0" w:oddVBand="0" w:evenVBand="0" w:oddHBand="0" w:evenHBand="0" w:firstRowFirstColumn="0" w:firstRowLastColumn="0" w:lastRowFirstColumn="0" w:lastRowLastColumn="0"/>
               <w:rPr>
                 <w:rFonts w:cstheme="minorHAnsi"/>
@@ -6440,6 +6720,7 @@
           </w:tcPr>
           <w:p>
             <w:pPr>
+              <w:widowControl w:val="0"/>
               <w:cnfStyle w:val="000000000000" w:firstRow="0" w:lastRow="0" w:firstColumn="0" w:lastColumn="0" w:oddVBand="0" w:evenVBand="0" w:oddHBand="0" w:evenHBand="0" w:firstRowFirstColumn="0" w:firstRowLastColumn="0" w:lastRowFirstColumn="0" w:lastRowLastColumn="0"/>
               <w:rPr>
                 <w:rFonts w:cstheme="minorHAnsi"/>
@@ -6515,6 +6796,7 @@
     </w:tbl>
     <w:p>
       <w:pPr>
+        <w:widowControl w:val="0"/>
         <w:rPr>
           <w:rFonts w:cstheme="minorHAnsi"/>
           <w:i/>
@@ -6570,6 +6852,7 @@
     </w:p>
     <w:p>
       <w:pPr>
+        <w:widowControl w:val="0"/>
         <w:rPr>
           <w:rFonts w:cstheme="minorHAnsi"/>
           <w:i/>
@@ -6625,6 +6908,7 @@
     </w:p>
     <w:p>
       <w:pPr>
+        <w:widowControl w:val="0"/>
         <w:rPr>
           <w:rFonts w:ascii="Magic Mushroom" w:hAnsi="Magic Mushroom" w:cs="Times New Roman"/>
           <w:bCs/>
@@ -6638,6 +6922,7 @@
     <w:p>
       <w:pPr>
         <w:pStyle w:val="Prrafodelista"/>
+        <w:widowControl w:val="0"/>
         <w:numPr>
           <w:ilvl w:val="0"/>
           <w:numId w:val="1"/>
@@ -6662,6 +6947,7 @@
     <w:p>
       <w:pPr>
         <w:pStyle w:val="Prrafodelista"/>
+        <w:widowControl w:val="0"/>
         <w:numPr>
           <w:ilvl w:val="0"/>
           <w:numId w:val="1"/>
@@ -6729,6 +7015,7 @@
           <w:p>
             <w:pPr>
               <w:pStyle w:val="Prrafodelista"/>
+              <w:widowControl w:val="0"/>
               <w:spacing w:after="0" w:line="240" w:lineRule="auto"/>
               <w:ind w:left="0"/>
               <w:jc w:val="center"/>
@@ -6759,6 +7046,7 @@
           <w:p>
             <w:pPr>
               <w:pStyle w:val="Prrafodelista"/>
+              <w:widowControl w:val="0"/>
               <w:spacing w:after="0" w:line="240" w:lineRule="auto"/>
               <w:ind w:left="0"/>
               <w:jc w:val="center"/>
@@ -6789,6 +7077,7 @@
           <w:p>
             <w:pPr>
               <w:pStyle w:val="Prrafodelista"/>
+              <w:widowControl w:val="0"/>
               <w:spacing w:after="0" w:line="240" w:lineRule="auto"/>
               <w:ind w:left="0"/>
               <w:jc w:val="center"/>
@@ -6822,6 +7111,7 @@
           <w:p>
             <w:pPr>
               <w:pStyle w:val="Prrafodelista"/>
+              <w:widowControl w:val="0"/>
               <w:spacing w:after="0" w:line="240" w:lineRule="auto"/>
               <w:ind w:left="0"/>
               <w:jc w:val="center"/>
@@ -6858,6 +7148,7 @@
           <w:p>
             <w:pPr>
               <w:pStyle w:val="Prrafodelista"/>
+              <w:widowControl w:val="0"/>
               <w:spacing w:after="0" w:line="240" w:lineRule="auto"/>
               <w:ind w:left="0"/>
               <w:jc w:val="center"/>
@@ -6882,6 +7173,7 @@
           <w:p>
             <w:pPr>
               <w:pStyle w:val="Prrafodelista"/>
+              <w:widowControl w:val="0"/>
               <w:spacing w:after="0" w:line="240" w:lineRule="auto"/>
               <w:ind w:left="0"/>
               <w:jc w:val="center"/>
@@ -6912,6 +7204,7 @@
           <w:p>
             <w:pPr>
               <w:pStyle w:val="Prrafodelista"/>
+              <w:widowControl w:val="0"/>
               <w:spacing w:after="0" w:line="240" w:lineRule="auto"/>
               <w:ind w:left="0"/>
               <w:jc w:val="center"/>
@@ -6942,6 +7235,7 @@
           <w:p>
             <w:pPr>
               <w:pStyle w:val="Prrafodelista"/>
+              <w:widowControl w:val="0"/>
               <w:spacing w:after="0" w:line="240" w:lineRule="auto"/>
               <w:ind w:left="0"/>
               <w:jc w:val="center"/>
@@ -6972,6 +7266,7 @@
           <w:p>
             <w:pPr>
               <w:pStyle w:val="Prrafodelista"/>
+              <w:widowControl w:val="0"/>
               <w:spacing w:after="0" w:line="240" w:lineRule="auto"/>
               <w:ind w:left="0"/>
               <w:jc w:val="center"/>
@@ -7006,6 +7301,7 @@
           <w:p>
             <w:pPr>
               <w:pStyle w:val="Prrafodelista"/>
+              <w:widowControl w:val="0"/>
               <w:spacing w:after="0" w:line="240" w:lineRule="auto"/>
               <w:ind w:left="0"/>
               <w:jc w:val="center"/>
@@ -7039,6 +7335,7 @@
           <w:p>
             <w:pPr>
               <w:pStyle w:val="Prrafodelista"/>
+              <w:widowControl w:val="0"/>
               <w:spacing w:after="0" w:line="240" w:lineRule="auto"/>
               <w:ind w:left="0"/>
               <w:rPr>
@@ -7071,6 +7368,7 @@
           <w:p>
             <w:pPr>
               <w:pStyle w:val="Prrafodelista"/>
+              <w:widowControl w:val="0"/>
               <w:spacing w:after="0" w:line="240" w:lineRule="auto"/>
               <w:ind w:left="0"/>
               <w:rPr>
@@ -7106,6 +7404,7 @@
           <w:p>
             <w:pPr>
               <w:pStyle w:val="Prrafodelista"/>
+              <w:widowControl w:val="0"/>
               <w:spacing w:after="0" w:line="240" w:lineRule="auto"/>
               <w:ind w:left="0"/>
               <w:rPr>
@@ -7144,6 +7443,7 @@
           <w:p>
             <w:pPr>
               <w:pStyle w:val="Prrafodelista"/>
+              <w:widowControl w:val="0"/>
               <w:spacing w:after="0" w:line="240" w:lineRule="auto"/>
               <w:ind w:left="0"/>
               <w:jc w:val="center"/>
@@ -7169,6 +7469,7 @@
           <w:p>
             <w:pPr>
               <w:pStyle w:val="Prrafodelista"/>
+              <w:widowControl w:val="0"/>
               <w:spacing w:after="0" w:line="240" w:lineRule="auto"/>
               <w:ind w:left="0"/>
               <w:jc w:val="center"/>
@@ -7205,6 +7506,7 @@
           <w:p>
             <w:pPr>
               <w:pStyle w:val="Prrafodelista"/>
+              <w:widowControl w:val="0"/>
               <w:spacing w:after="0" w:line="240" w:lineRule="auto"/>
               <w:ind w:left="0"/>
               <w:jc w:val="center"/>
@@ -7237,6 +7539,7 @@
           <w:p>
             <w:pPr>
               <w:pStyle w:val="Prrafodelista"/>
+              <w:widowControl w:val="0"/>
               <w:spacing w:after="0" w:line="240" w:lineRule="auto"/>
               <w:ind w:left="0"/>
               <w:jc w:val="center"/>
@@ -7269,6 +7572,7 @@
           <w:p>
             <w:pPr>
               <w:pStyle w:val="Prrafodelista"/>
+              <w:widowControl w:val="0"/>
               <w:spacing w:after="0" w:line="240" w:lineRule="auto"/>
               <w:ind w:left="0"/>
               <w:jc w:val="center"/>
@@ -7307,6 +7611,7 @@
           <w:p>
             <w:pPr>
               <w:pStyle w:val="Prrafodelista"/>
+              <w:widowControl w:val="0"/>
               <w:spacing w:after="0" w:line="240" w:lineRule="auto"/>
               <w:ind w:left="0"/>
               <w:rPr>
@@ -7339,6 +7644,7 @@
           <w:p>
             <w:pPr>
               <w:pStyle w:val="Prrafodelista"/>
+              <w:widowControl w:val="0"/>
               <w:spacing w:after="0" w:line="240" w:lineRule="auto"/>
               <w:ind w:left="0"/>
               <w:rPr>
@@ -7403,6 +7709,7 @@
           <w:p>
             <w:pPr>
               <w:pStyle w:val="Prrafodelista"/>
+              <w:widowControl w:val="0"/>
               <w:spacing w:after="0" w:line="240" w:lineRule="auto"/>
               <w:ind w:left="0"/>
               <w:rPr>
@@ -7470,6 +7777,7 @@
           <w:p>
             <w:pPr>
               <w:pStyle w:val="Prrafodelista"/>
+              <w:widowControl w:val="0"/>
               <w:spacing w:after="0" w:line="240" w:lineRule="auto"/>
               <w:ind w:left="0"/>
               <w:rPr>
@@ -7541,6 +7849,7 @@
           <w:p>
             <w:pPr>
               <w:pStyle w:val="Prrafodelista"/>
+              <w:widowControl w:val="0"/>
               <w:spacing w:after="0" w:line="240" w:lineRule="auto"/>
               <w:ind w:left="0"/>
               <w:rPr>
@@ -7565,6 +7874,7 @@
           <w:p>
             <w:pPr>
               <w:pStyle w:val="Prrafodelista"/>
+              <w:widowControl w:val="0"/>
               <w:spacing w:after="0" w:line="240" w:lineRule="auto"/>
               <w:ind w:left="0"/>
               <w:jc w:val="center"/>
@@ -7601,6 +7911,7 @@
           <w:p>
             <w:pPr>
               <w:pStyle w:val="Prrafodelista"/>
+              <w:widowControl w:val="0"/>
               <w:spacing w:after="0" w:line="240" w:lineRule="auto"/>
               <w:ind w:left="0"/>
               <w:jc w:val="center"/>
@@ -7633,6 +7944,7 @@
           <w:p>
             <w:pPr>
               <w:pStyle w:val="Prrafodelista"/>
+              <w:widowControl w:val="0"/>
               <w:spacing w:after="0" w:line="240" w:lineRule="auto"/>
               <w:ind w:left="0"/>
               <w:jc w:val="center"/>
@@ -7665,6 +7977,7 @@
           <w:p>
             <w:pPr>
               <w:pStyle w:val="Prrafodelista"/>
+              <w:widowControl w:val="0"/>
               <w:spacing w:after="0" w:line="240" w:lineRule="auto"/>
               <w:ind w:left="0"/>
               <w:jc w:val="center"/>
@@ -7703,6 +8016,7 @@
           <w:p>
             <w:pPr>
               <w:pStyle w:val="Prrafodelista"/>
+              <w:widowControl w:val="0"/>
               <w:spacing w:after="0" w:line="240" w:lineRule="auto"/>
               <w:ind w:left="0"/>
               <w:jc w:val="center"/>
@@ -7736,6 +8050,7 @@
           <w:p>
             <w:pPr>
               <w:pStyle w:val="Prrafodelista"/>
+              <w:widowControl w:val="0"/>
               <w:spacing w:after="0" w:line="240" w:lineRule="auto"/>
               <w:ind w:left="0"/>
               <w:rPr>
@@ -7768,6 +8083,7 @@
           <w:p>
             <w:pPr>
               <w:pStyle w:val="Prrafodelista"/>
+              <w:widowControl w:val="0"/>
               <w:spacing w:after="0" w:line="240" w:lineRule="auto"/>
               <w:ind w:left="0"/>
               <w:rPr>
@@ -7803,6 +8119,7 @@
           <w:p>
             <w:pPr>
               <w:pStyle w:val="Prrafodelista"/>
+              <w:widowControl w:val="0"/>
               <w:spacing w:after="0" w:line="240" w:lineRule="auto"/>
               <w:ind w:left="0"/>
               <w:rPr>
@@ -7841,6 +8158,7 @@
           <w:p>
             <w:pPr>
               <w:pStyle w:val="Prrafodelista"/>
+              <w:widowControl w:val="0"/>
               <w:spacing w:after="0" w:line="240" w:lineRule="auto"/>
               <w:ind w:left="0"/>
               <w:jc w:val="center"/>
@@ -7866,6 +8184,7 @@
           <w:p>
             <w:pPr>
               <w:pStyle w:val="Prrafodelista"/>
+              <w:widowControl w:val="0"/>
               <w:spacing w:after="0" w:line="240" w:lineRule="auto"/>
               <w:ind w:left="0"/>
               <w:jc w:val="center"/>
@@ -7902,6 +8221,7 @@
           <w:p>
             <w:pPr>
               <w:pStyle w:val="Prrafodelista"/>
+              <w:widowControl w:val="0"/>
               <w:spacing w:after="0" w:line="240" w:lineRule="auto"/>
               <w:ind w:left="0"/>
               <w:jc w:val="center"/>
@@ -7934,6 +8254,7 @@
           <w:p>
             <w:pPr>
               <w:pStyle w:val="Prrafodelista"/>
+              <w:widowControl w:val="0"/>
               <w:spacing w:after="0" w:line="240" w:lineRule="auto"/>
               <w:ind w:left="0"/>
               <w:jc w:val="center"/>
@@ -7966,6 +8287,7 @@
           <w:p>
             <w:pPr>
               <w:pStyle w:val="Prrafodelista"/>
+              <w:widowControl w:val="0"/>
               <w:spacing w:after="0" w:line="240" w:lineRule="auto"/>
               <w:ind w:left="0"/>
               <w:jc w:val="center"/>
@@ -8004,6 +8326,7 @@
           <w:p>
             <w:pPr>
               <w:pStyle w:val="Prrafodelista"/>
+              <w:widowControl w:val="0"/>
               <w:spacing w:after="0" w:line="240" w:lineRule="auto"/>
               <w:ind w:left="0"/>
               <w:jc w:val="center"/>
@@ -8037,6 +8360,7 @@
           <w:p>
             <w:pPr>
               <w:pStyle w:val="Prrafodelista"/>
+              <w:widowControl w:val="0"/>
               <w:spacing w:after="0" w:line="240" w:lineRule="auto"/>
               <w:ind w:left="0"/>
               <w:rPr>
@@ -8069,6 +8393,7 @@
           <w:p>
             <w:pPr>
               <w:pStyle w:val="Prrafodelista"/>
+              <w:widowControl w:val="0"/>
               <w:spacing w:after="0" w:line="240" w:lineRule="auto"/>
               <w:ind w:left="0"/>
               <w:rPr>
@@ -8104,6 +8429,7 @@
           <w:p>
             <w:pPr>
               <w:pStyle w:val="Prrafodelista"/>
+              <w:widowControl w:val="0"/>
               <w:spacing w:after="0" w:line="240" w:lineRule="auto"/>
               <w:ind w:left="0"/>
               <w:rPr>
@@ -8142,6 +8468,7 @@
           <w:p>
             <w:pPr>
               <w:pStyle w:val="Prrafodelista"/>
+              <w:widowControl w:val="0"/>
               <w:spacing w:after="0" w:line="240" w:lineRule="auto"/>
               <w:ind w:left="0"/>
               <w:jc w:val="center"/>
@@ -8167,6 +8494,7 @@
           <w:p>
             <w:pPr>
               <w:pStyle w:val="Prrafodelista"/>
+              <w:widowControl w:val="0"/>
               <w:spacing w:after="0" w:line="240" w:lineRule="auto"/>
               <w:ind w:left="0"/>
               <w:jc w:val="center"/>
@@ -8203,6 +8531,7 @@
           <w:p>
             <w:pPr>
               <w:pStyle w:val="Prrafodelista"/>
+              <w:widowControl w:val="0"/>
               <w:spacing w:after="0" w:line="240" w:lineRule="auto"/>
               <w:ind w:left="0"/>
               <w:jc w:val="center"/>
@@ -8235,6 +8564,7 @@
           <w:p>
             <w:pPr>
               <w:pStyle w:val="Prrafodelista"/>
+              <w:widowControl w:val="0"/>
               <w:spacing w:after="0" w:line="240" w:lineRule="auto"/>
               <w:ind w:left="0"/>
               <w:jc w:val="center"/>
@@ -8267,6 +8597,7 @@
           <w:p>
             <w:pPr>
               <w:pStyle w:val="Prrafodelista"/>
+              <w:widowControl w:val="0"/>
               <w:spacing w:after="0" w:line="240" w:lineRule="auto"/>
               <w:ind w:left="0"/>
               <w:jc w:val="center"/>
@@ -8305,6 +8636,7 @@
           <w:p>
             <w:pPr>
               <w:pStyle w:val="Prrafodelista"/>
+              <w:widowControl w:val="0"/>
               <w:spacing w:after="0" w:line="240" w:lineRule="auto"/>
               <w:ind w:left="0"/>
               <w:jc w:val="center"/>
@@ -8338,6 +8670,7 @@
           <w:p>
             <w:pPr>
               <w:pStyle w:val="Prrafodelista"/>
+              <w:widowControl w:val="0"/>
               <w:spacing w:after="0" w:line="240" w:lineRule="auto"/>
               <w:ind w:left="0"/>
               <w:rPr>
@@ -8370,6 +8703,7 @@
           <w:p>
             <w:pPr>
               <w:pStyle w:val="Prrafodelista"/>
+              <w:widowControl w:val="0"/>
               <w:spacing w:after="0" w:line="240" w:lineRule="auto"/>
               <w:ind w:left="0"/>
               <w:rPr>
@@ -8405,6 +8739,7 @@
           <w:p>
             <w:pPr>
               <w:pStyle w:val="Prrafodelista"/>
+              <w:widowControl w:val="0"/>
               <w:spacing w:after="0" w:line="240" w:lineRule="auto"/>
               <w:ind w:left="0"/>
               <w:rPr>
@@ -8443,6 +8778,7 @@
           <w:p>
             <w:pPr>
               <w:pStyle w:val="Prrafodelista"/>
+              <w:widowControl w:val="0"/>
               <w:spacing w:after="0" w:line="240" w:lineRule="auto"/>
               <w:ind w:left="0"/>
               <w:jc w:val="center"/>
@@ -8469,6 +8805,7 @@
           <w:p>
             <w:pPr>
               <w:pStyle w:val="Prrafodelista"/>
+              <w:widowControl w:val="0"/>
               <w:spacing w:after="0" w:line="240" w:lineRule="auto"/>
               <w:ind w:left="0"/>
               <w:jc w:val="center"/>
@@ -8506,6 +8843,7 @@
           <w:p>
             <w:pPr>
               <w:pStyle w:val="Prrafodelista"/>
+              <w:widowControl w:val="0"/>
               <w:spacing w:after="0" w:line="240" w:lineRule="auto"/>
               <w:ind w:left="0"/>
               <w:jc w:val="center"/>
@@ -8563,6 +8901,7 @@
           <w:p>
             <w:pPr>
               <w:pStyle w:val="Prrafodelista"/>
+              <w:widowControl w:val="0"/>
               <w:spacing w:after="0" w:line="240" w:lineRule="auto"/>
               <w:ind w:left="0"/>
               <w:jc w:val="center"/>
@@ -8620,6 +8959,7 @@
           <w:p>
             <w:pPr>
               <w:pStyle w:val="Prrafodelista"/>
+              <w:widowControl w:val="0"/>
               <w:spacing w:after="0" w:line="240" w:lineRule="auto"/>
               <w:ind w:left="0"/>
               <w:jc w:val="center"/>
@@ -8682,6 +9022,7 @@
           <w:p>
             <w:pPr>
               <w:pStyle w:val="Prrafodelista"/>
+              <w:widowControl w:val="0"/>
               <w:spacing w:after="0" w:line="240" w:lineRule="auto"/>
               <w:ind w:left="0"/>
               <w:jc w:val="center"/>
@@ -8715,6 +9056,7 @@
           <w:p>
             <w:pPr>
               <w:pStyle w:val="Prrafodelista"/>
+              <w:widowControl w:val="0"/>
               <w:spacing w:after="0" w:line="240" w:lineRule="auto"/>
               <w:ind w:left="0"/>
               <w:rPr>
@@ -8747,6 +9089,7 @@
           <w:p>
             <w:pPr>
               <w:pStyle w:val="Prrafodelista"/>
+              <w:widowControl w:val="0"/>
               <w:spacing w:after="0" w:line="240" w:lineRule="auto"/>
               <w:ind w:left="0"/>
               <w:rPr>
@@ -8782,6 +9125,7 @@
           <w:p>
             <w:pPr>
               <w:pStyle w:val="Prrafodelista"/>
+              <w:widowControl w:val="0"/>
               <w:spacing w:after="0" w:line="240" w:lineRule="auto"/>
               <w:ind w:left="0"/>
               <w:rPr>
@@ -8820,6 +9164,7 @@
           <w:p>
             <w:pPr>
               <w:pStyle w:val="Prrafodelista"/>
+              <w:widowControl w:val="0"/>
               <w:spacing w:after="0" w:line="240" w:lineRule="auto"/>
               <w:ind w:left="0"/>
               <w:jc w:val="center"/>
@@ -8845,6 +9190,7 @@
           <w:p>
             <w:pPr>
               <w:pStyle w:val="Prrafodelista"/>
+              <w:widowControl w:val="0"/>
               <w:spacing w:after="0" w:line="240" w:lineRule="auto"/>
               <w:ind w:left="0"/>
               <w:jc w:val="center"/>
@@ -8881,6 +9227,7 @@
           <w:p>
             <w:pPr>
               <w:pStyle w:val="Prrafodelista"/>
+              <w:widowControl w:val="0"/>
               <w:spacing w:after="0" w:line="240" w:lineRule="auto"/>
               <w:ind w:left="0"/>
               <w:jc w:val="center"/>
@@ -8913,6 +9260,7 @@
           <w:p>
             <w:pPr>
               <w:pStyle w:val="Prrafodelista"/>
+              <w:widowControl w:val="0"/>
               <w:spacing w:after="0" w:line="240" w:lineRule="auto"/>
               <w:ind w:left="0"/>
               <w:jc w:val="center"/>
@@ -8945,6 +9293,7 @@
           <w:p>
             <w:pPr>
               <w:pStyle w:val="Prrafodelista"/>
+              <w:widowControl w:val="0"/>
               <w:spacing w:after="0" w:line="240" w:lineRule="auto"/>
               <w:ind w:left="0"/>
               <w:jc w:val="center"/>
@@ -8983,6 +9332,7 @@
           <w:p>
             <w:pPr>
               <w:pStyle w:val="Prrafodelista"/>
+              <w:widowControl w:val="0"/>
               <w:spacing w:after="0" w:line="240" w:lineRule="auto"/>
               <w:ind w:left="0"/>
               <w:jc w:val="center"/>
@@ -9016,6 +9366,7 @@
           <w:p>
             <w:pPr>
               <w:pStyle w:val="Prrafodelista"/>
+              <w:widowControl w:val="0"/>
               <w:spacing w:after="0" w:line="240" w:lineRule="auto"/>
               <w:ind w:left="0"/>
               <w:rPr>
@@ -9048,6 +9399,7 @@
           <w:p>
             <w:pPr>
               <w:pStyle w:val="Prrafodelista"/>
+              <w:widowControl w:val="0"/>
               <w:spacing w:after="0" w:line="240" w:lineRule="auto"/>
               <w:ind w:left="0"/>
               <w:rPr>
@@ -9083,6 +9435,7 @@
           <w:p>
             <w:pPr>
               <w:pStyle w:val="Prrafodelista"/>
+              <w:widowControl w:val="0"/>
               <w:spacing w:after="0" w:line="240" w:lineRule="auto"/>
               <w:ind w:left="0"/>
               <w:rPr>
@@ -9121,6 +9474,7 @@
           <w:p>
             <w:pPr>
               <w:pStyle w:val="Prrafodelista"/>
+              <w:widowControl w:val="0"/>
               <w:spacing w:after="0" w:line="240" w:lineRule="auto"/>
               <w:ind w:left="0"/>
               <w:jc w:val="center"/>
@@ -9146,6 +9500,7 @@
           <w:p>
             <w:pPr>
               <w:pStyle w:val="Prrafodelista"/>
+              <w:widowControl w:val="0"/>
               <w:spacing w:after="0" w:line="240" w:lineRule="auto"/>
               <w:ind w:left="0"/>
               <w:jc w:val="center"/>
@@ -9182,6 +9537,7 @@
           <w:p>
             <w:pPr>
               <w:pStyle w:val="Prrafodelista"/>
+              <w:widowControl w:val="0"/>
               <w:spacing w:after="0" w:line="240" w:lineRule="auto"/>
               <w:ind w:left="0"/>
               <w:jc w:val="center"/>
@@ -9214,6 +9570,7 @@
           <w:p>
             <w:pPr>
               <w:pStyle w:val="Prrafodelista"/>
+              <w:widowControl w:val="0"/>
               <w:spacing w:after="0" w:line="240" w:lineRule="auto"/>
               <w:ind w:left="0"/>
               <w:jc w:val="center"/>
@@ -9246,6 +9603,7 @@
           <w:p>
             <w:pPr>
               <w:pStyle w:val="Prrafodelista"/>
+              <w:widowControl w:val="0"/>
               <w:spacing w:after="0" w:line="240" w:lineRule="auto"/>
               <w:ind w:left="0"/>
               <w:jc w:val="center"/>
@@ -9284,6 +9642,7 @@
           <w:p>
             <w:pPr>
               <w:pStyle w:val="Prrafodelista"/>
+              <w:widowControl w:val="0"/>
               <w:spacing w:after="0" w:line="240" w:lineRule="auto"/>
               <w:ind w:left="0"/>
               <w:jc w:val="center"/>
@@ -9317,6 +9676,7 @@
           <w:p>
             <w:pPr>
               <w:pStyle w:val="Prrafodelista"/>
+              <w:widowControl w:val="0"/>
               <w:spacing w:after="0" w:line="240" w:lineRule="auto"/>
               <w:ind w:left="0"/>
               <w:rPr>
@@ -9349,6 +9709,7 @@
           <w:p>
             <w:pPr>
               <w:pStyle w:val="Prrafodelista"/>
+              <w:widowControl w:val="0"/>
               <w:spacing w:after="0" w:line="240" w:lineRule="auto"/>
               <w:ind w:left="0"/>
               <w:rPr>
@@ -9384,6 +9745,7 @@
           <w:p>
             <w:pPr>
               <w:pStyle w:val="Prrafodelista"/>
+              <w:widowControl w:val="0"/>
               <w:spacing w:after="0" w:line="240" w:lineRule="auto"/>
               <w:ind w:left="0"/>
               <w:rPr>
@@ -9422,6 +9784,7 @@
           <w:p>
             <w:pPr>
               <w:pStyle w:val="Prrafodelista"/>
+              <w:widowControl w:val="0"/>
               <w:spacing w:after="0" w:line="240" w:lineRule="auto"/>
               <w:ind w:left="0"/>
               <w:jc w:val="center"/>
@@ -9448,6 +9811,7 @@
           <w:p>
             <w:pPr>
               <w:pStyle w:val="Prrafodelista"/>
+              <w:widowControl w:val="0"/>
               <w:spacing w:after="0" w:line="240" w:lineRule="auto"/>
               <w:ind w:left="0"/>
               <w:jc w:val="center"/>
@@ -9487,6 +9851,7 @@
           <w:p>
             <w:pPr>
               <w:pStyle w:val="Prrafodelista"/>
+              <w:widowControl w:val="0"/>
               <w:spacing w:after="0" w:line="240" w:lineRule="auto"/>
               <w:ind w:left="0"/>
               <w:jc w:val="center"/>
@@ -9519,6 +9884,7 @@
           <w:p>
             <w:pPr>
               <w:pStyle w:val="Prrafodelista"/>
+              <w:widowControl w:val="0"/>
               <w:spacing w:after="0" w:line="240" w:lineRule="auto"/>
               <w:ind w:left="0"/>
               <w:jc w:val="center"/>
@@ -9551,6 +9917,7 @@
           <w:p>
             <w:pPr>
               <w:pStyle w:val="Prrafodelista"/>
+              <w:widowControl w:val="0"/>
               <w:spacing w:after="0" w:line="240" w:lineRule="auto"/>
               <w:ind w:left="0"/>
               <w:jc w:val="center"/>
@@ -9592,6 +9959,7 @@
           <w:p>
             <w:pPr>
               <w:pStyle w:val="Prrafodelista"/>
+              <w:widowControl w:val="0"/>
               <w:spacing w:after="0" w:line="240" w:lineRule="auto"/>
               <w:ind w:left="0"/>
               <w:jc w:val="center"/>
@@ -9628,6 +9996,7 @@
           <w:p>
             <w:pPr>
               <w:pStyle w:val="Prrafodelista"/>
+              <w:widowControl w:val="0"/>
               <w:spacing w:after="0" w:line="240" w:lineRule="auto"/>
               <w:ind w:left="0"/>
               <w:rPr>
@@ -9660,6 +10029,7 @@
           <w:p>
             <w:pPr>
               <w:pStyle w:val="Prrafodelista"/>
+              <w:widowControl w:val="0"/>
               <w:spacing w:after="0" w:line="240" w:lineRule="auto"/>
               <w:ind w:left="0"/>
               <w:rPr>
@@ -9695,6 +10065,7 @@
           <w:p>
             <w:pPr>
               <w:pStyle w:val="Prrafodelista"/>
+              <w:widowControl w:val="0"/>
               <w:spacing w:after="0" w:line="240" w:lineRule="auto"/>
               <w:ind w:left="0"/>
               <w:rPr>
@@ -9733,6 +10104,7 @@
           <w:p>
             <w:pPr>
               <w:pStyle w:val="Prrafodelista"/>
+              <w:widowControl w:val="0"/>
               <w:spacing w:after="0" w:line="240" w:lineRule="auto"/>
               <w:ind w:left="0"/>
               <w:jc w:val="center"/>
@@ -9759,6 +10131,7 @@
           <w:p>
             <w:pPr>
               <w:pStyle w:val="Prrafodelista"/>
+              <w:widowControl w:val="0"/>
               <w:spacing w:after="0" w:line="240" w:lineRule="auto"/>
               <w:ind w:left="0"/>
               <w:jc w:val="center"/>
@@ -9798,6 +10171,7 @@
           <w:p>
             <w:pPr>
               <w:pStyle w:val="Prrafodelista"/>
+              <w:widowControl w:val="0"/>
               <w:spacing w:after="0" w:line="240" w:lineRule="auto"/>
               <w:ind w:left="0"/>
               <w:jc w:val="center"/>
@@ -9833,6 +10207,7 @@
           <w:p>
             <w:pPr>
               <w:pStyle w:val="Prrafodelista"/>
+              <w:widowControl w:val="0"/>
               <w:spacing w:after="0" w:line="240" w:lineRule="auto"/>
               <w:ind w:left="0"/>
               <w:jc w:val="center"/>
@@ -9868,6 +10243,7 @@
           <w:p>
             <w:pPr>
               <w:pStyle w:val="Prrafodelista"/>
+              <w:widowControl w:val="0"/>
               <w:spacing w:after="0" w:line="240" w:lineRule="auto"/>
               <w:ind w:left="0"/>
               <w:jc w:val="center"/>
@@ -9909,6 +10285,7 @@
           <w:p>
             <w:pPr>
               <w:pStyle w:val="Prrafodelista"/>
+              <w:widowControl w:val="0"/>
               <w:spacing w:after="0" w:line="240" w:lineRule="auto"/>
               <w:ind w:left="0"/>
               <w:jc w:val="center"/>
@@ -9945,6 +10322,7 @@
           <w:p>
             <w:pPr>
               <w:pStyle w:val="Prrafodelista"/>
+              <w:widowControl w:val="0"/>
               <w:spacing w:after="0" w:line="240" w:lineRule="auto"/>
               <w:ind w:left="0"/>
               <w:rPr>
@@ -9980,6 +10358,7 @@
           <w:p>
             <w:pPr>
               <w:pStyle w:val="Prrafodelista"/>
+              <w:widowControl w:val="0"/>
               <w:spacing w:after="0" w:line="240" w:lineRule="auto"/>
               <w:ind w:left="0"/>
               <w:rPr>
@@ -10015,6 +10394,7 @@
           <w:p>
             <w:pPr>
               <w:pStyle w:val="Prrafodelista"/>
+              <w:widowControl w:val="0"/>
               <w:spacing w:after="0" w:line="240" w:lineRule="auto"/>
               <w:ind w:left="0"/>
               <w:rPr>
@@ -10053,6 +10433,7 @@
           <w:p>
             <w:pPr>
               <w:pStyle w:val="Prrafodelista"/>
+              <w:widowControl w:val="0"/>
               <w:spacing w:after="0" w:line="240" w:lineRule="auto"/>
               <w:ind w:left="0"/>
               <w:jc w:val="center"/>
@@ -10082,6 +10463,7 @@
           <w:p>
             <w:pPr>
               <w:pStyle w:val="Prrafodelista"/>
+              <w:widowControl w:val="0"/>
               <w:spacing w:after="0" w:line="240" w:lineRule="auto"/>
               <w:ind w:left="0"/>
               <w:jc w:val="center"/>
@@ -10111,6 +10493,7 @@
           <w:p>
             <w:pPr>
               <w:pStyle w:val="Prrafodelista"/>
+              <w:widowControl w:val="0"/>
               <w:spacing w:after="0" w:line="240" w:lineRule="auto"/>
               <w:ind w:left="0"/>
               <w:jc w:val="center"/>
@@ -10138,6 +10521,7 @@
           <w:p>
             <w:pPr>
               <w:pStyle w:val="Prrafodelista"/>
+              <w:widowControl w:val="0"/>
               <w:spacing w:after="0" w:line="240" w:lineRule="auto"/>
               <w:ind w:left="0"/>
               <w:jc w:val="center"/>
@@ -10173,6 +10557,7 @@
           <w:p>
             <w:pPr>
               <w:pStyle w:val="Prrafodelista"/>
+              <w:widowControl w:val="0"/>
               <w:spacing w:after="0" w:line="240" w:lineRule="auto"/>
               <w:ind w:left="0"/>
               <w:jc w:val="center"/>
@@ -10241,6 +10626,7 @@
           <w:p>
             <w:pPr>
               <w:pStyle w:val="Prrafodelista"/>
+              <w:widowControl w:val="0"/>
               <w:spacing w:after="0" w:line="240" w:lineRule="auto"/>
               <w:ind w:left="0"/>
               <w:rPr>
@@ -10267,6 +10653,7 @@
           <w:p>
             <w:pPr>
               <w:pStyle w:val="Prrafodelista"/>
+              <w:widowControl w:val="0"/>
               <w:spacing w:after="0" w:line="240" w:lineRule="auto"/>
               <w:ind w:left="0"/>
               <w:rPr>
@@ -10291,6 +10678,7 @@
           <w:p>
             <w:pPr>
               <w:pStyle w:val="Prrafodelista"/>
+              <w:widowControl w:val="0"/>
               <w:spacing w:after="0" w:line="240" w:lineRule="auto"/>
               <w:ind w:left="0"/>
               <w:jc w:val="center"/>
@@ -10324,6 +10712,7 @@
           </w:tcPr>
           <w:p>
             <w:pPr>
+              <w:widowControl w:val="0"/>
               <w:rPr>
                 <w:rFonts w:cstheme="minorHAnsi"/>
                 <w:b/>
@@ -10379,6 +10768,7 @@
           </w:p>
           <w:p>
             <w:pPr>
+              <w:widowControl w:val="0"/>
               <w:rPr>
                 <w:rFonts w:cstheme="minorHAnsi"/>
                 <w:i/>
@@ -10426,6 +10816,7 @@
           </w:p>
           <w:p>
             <w:pPr>
+              <w:widowControl w:val="0"/>
               <w:rPr>
                 <w:rFonts w:cstheme="minorHAnsi"/>
                 <w:b/>
@@ -10490,6 +10881,7 @@
           <w:p>
             <w:pPr>
               <w:pStyle w:val="Prrafodelista"/>
+              <w:widowControl w:val="0"/>
               <w:spacing w:after="0" w:line="240" w:lineRule="auto"/>
               <w:ind w:left="0"/>
               <w:jc w:val="center"/>
@@ -10520,6 +10912,7 @@
           <w:p>
             <w:pPr>
               <w:pStyle w:val="Prrafodelista"/>
+              <w:widowControl w:val="0"/>
               <w:spacing w:after="0" w:line="240" w:lineRule="auto"/>
               <w:ind w:left="0"/>
               <w:jc w:val="center"/>
@@ -10550,6 +10943,7 @@
           <w:p>
             <w:pPr>
               <w:pStyle w:val="Prrafodelista"/>
+              <w:widowControl w:val="0"/>
               <w:spacing w:after="0" w:line="240" w:lineRule="auto"/>
               <w:ind w:left="0"/>
               <w:jc w:val="center"/>
@@ -10581,6 +10975,7 @@
           <w:p>
             <w:pPr>
               <w:pStyle w:val="Prrafodelista"/>
+              <w:widowControl w:val="0"/>
               <w:spacing w:after="0" w:line="240" w:lineRule="auto"/>
               <w:ind w:left="0"/>
               <w:jc w:val="center"/>
@@ -10612,6 +11007,7 @@
           <w:p>
             <w:pPr>
               <w:pStyle w:val="Prrafodelista"/>
+              <w:widowControl w:val="0"/>
               <w:spacing w:after="0" w:line="240" w:lineRule="auto"/>
               <w:ind w:left="0"/>
               <w:jc w:val="center"/>
@@ -10633,6 +11029,7 @@
     <w:p>
       <w:pPr>
         <w:pStyle w:val="Prrafodelista"/>
+        <w:widowControl w:val="0"/>
         <w:spacing w:line="240" w:lineRule="auto"/>
         <w:ind w:left="142"/>
         <w:rPr>
@@ -10647,6 +11044,7 @@
     <w:p>
       <w:pPr>
         <w:pStyle w:val="Prrafodelista"/>
+        <w:widowControl w:val="0"/>
         <w:numPr>
           <w:ilvl w:val="0"/>
           <w:numId w:val="1"/>
@@ -10724,6 +11122,7 @@
           <w:p>
             <w:pPr>
               <w:pStyle w:val="Prrafodelista"/>
+              <w:widowControl w:val="0"/>
               <w:spacing w:after="0" w:line="240" w:lineRule="auto"/>
               <w:ind w:left="0"/>
               <w:jc w:val="center"/>
@@ -10761,6 +11160,7 @@
           <w:p>
             <w:pPr>
               <w:pStyle w:val="Prrafodelista"/>
+              <w:widowControl w:val="0"/>
               <w:spacing w:after="0" w:line="240" w:lineRule="auto"/>
               <w:ind w:left="0"/>
               <w:jc w:val="center"/>
@@ -10798,6 +11198,7 @@
           <w:p>
             <w:pPr>
               <w:pStyle w:val="Prrafodelista"/>
+              <w:widowControl w:val="0"/>
               <w:spacing w:after="0" w:line="240" w:lineRule="auto"/>
               <w:ind w:left="0"/>
               <w:jc w:val="center"/>
@@ -10835,6 +11236,7 @@
           <w:p>
             <w:pPr>
               <w:pStyle w:val="Prrafodelista"/>
+              <w:widowControl w:val="0"/>
               <w:spacing w:after="0" w:line="240" w:lineRule="auto"/>
               <w:ind w:left="0"/>
               <w:jc w:val="center"/>
@@ -10871,6 +11273,7 @@
           <w:p>
             <w:pPr>
               <w:pStyle w:val="Prrafodelista"/>
+              <w:widowControl w:val="0"/>
               <w:spacing w:after="0" w:line="240" w:lineRule="auto"/>
               <w:ind w:left="0"/>
               <w:jc w:val="center"/>
@@ -10906,6 +11309,7 @@
           <w:p>
             <w:pPr>
               <w:pStyle w:val="Prrafodelista"/>
+              <w:widowControl w:val="0"/>
               <w:spacing w:after="0" w:line="240" w:lineRule="auto"/>
               <w:ind w:left="0"/>
               <w:jc w:val="center"/>
@@ -10939,6 +11343,7 @@
           <w:p>
             <w:pPr>
               <w:pStyle w:val="Prrafodelista"/>
+              <w:widowControl w:val="0"/>
               <w:spacing w:after="0" w:line="240" w:lineRule="auto"/>
               <w:ind w:left="0"/>
               <w:jc w:val="center"/>
@@ -10971,6 +11376,7 @@
           <w:p>
             <w:pPr>
               <w:pStyle w:val="Prrafodelista"/>
+              <w:widowControl w:val="0"/>
               <w:spacing w:after="0" w:line="240" w:lineRule="auto"/>
               <w:ind w:left="708" w:hanging="708"/>
               <w:jc w:val="center"/>
@@ -11003,6 +11409,7 @@
           <w:p>
             <w:pPr>
               <w:pStyle w:val="Prrafodelista"/>
+              <w:widowControl w:val="0"/>
               <w:spacing w:after="0" w:line="240" w:lineRule="auto"/>
               <w:ind w:left="0"/>
               <w:jc w:val="center"/>
@@ -11035,6 +11442,7 @@
           <w:p>
             <w:pPr>
               <w:pStyle w:val="Prrafodelista"/>
+              <w:widowControl w:val="0"/>
               <w:spacing w:after="0" w:line="240" w:lineRule="auto"/>
               <w:ind w:left="0"/>
               <w:jc w:val="center"/>
@@ -11067,6 +11475,7 @@
           <w:p>
             <w:pPr>
               <w:pStyle w:val="Prrafodelista"/>
+              <w:widowControl w:val="0"/>
               <w:spacing w:after="0" w:line="240" w:lineRule="auto"/>
               <w:ind w:left="0"/>
               <w:jc w:val="center"/>
@@ -11099,6 +11508,7 @@
           <w:p>
             <w:pPr>
               <w:pStyle w:val="Prrafodelista"/>
+              <w:widowControl w:val="0"/>
               <w:spacing w:after="0" w:line="240" w:lineRule="auto"/>
               <w:ind w:left="0"/>
               <w:jc w:val="center"/>
@@ -11131,6 +11541,7 @@
           <w:p>
             <w:pPr>
               <w:pStyle w:val="Prrafodelista"/>
+              <w:widowControl w:val="0"/>
               <w:spacing w:after="0" w:line="240" w:lineRule="auto"/>
               <w:ind w:left="0"/>
               <w:jc w:val="center"/>
@@ -11163,6 +11574,7 @@
           <w:p>
             <w:pPr>
               <w:pStyle w:val="Prrafodelista"/>
+              <w:widowControl w:val="0"/>
               <w:spacing w:after="0" w:line="240" w:lineRule="auto"/>
               <w:ind w:left="0"/>
               <w:jc w:val="center"/>
@@ -11199,6 +11611,7 @@
           <w:p>
             <w:pPr>
               <w:pStyle w:val="Prrafodelista"/>
+              <w:widowControl w:val="0"/>
               <w:spacing w:after="0" w:line="240" w:lineRule="auto"/>
               <w:ind w:left="113" w:right="113"/>
               <w:jc w:val="center"/>
@@ -11238,6 +11651,7 @@
           <w:p>
             <w:pPr>
               <w:pStyle w:val="Prrafodelista"/>
+              <w:widowControl w:val="0"/>
               <w:spacing w:after="0" w:line="240" w:lineRule="auto"/>
               <w:ind w:left="0"/>
               <w:jc w:val="center"/>
@@ -11271,6 +11685,7 @@
           <w:p>
             <w:pPr>
               <w:pStyle w:val="Prrafodelista"/>
+              <w:widowControl w:val="0"/>
               <w:spacing w:after="0" w:line="240" w:lineRule="auto"/>
               <w:ind w:left="0"/>
               <w:jc w:val="center"/>
@@ -11304,6 +11719,7 @@
           <w:p>
             <w:pPr>
               <w:pStyle w:val="Prrafodelista"/>
+              <w:widowControl w:val="0"/>
               <w:spacing w:after="0" w:line="240" w:lineRule="auto"/>
               <w:ind w:left="0"/>
               <w:jc w:val="center"/>
@@ -11337,6 +11753,7 @@
           <w:p>
             <w:pPr>
               <w:pStyle w:val="Prrafodelista"/>
+              <w:widowControl w:val="0"/>
               <w:spacing w:after="0" w:line="240" w:lineRule="auto"/>
               <w:ind w:left="0"/>
               <w:jc w:val="center"/>
@@ -11370,6 +11787,7 @@
           <w:p>
             <w:pPr>
               <w:pStyle w:val="Prrafodelista"/>
+              <w:widowControl w:val="0"/>
               <w:spacing w:after="0" w:line="240" w:lineRule="auto"/>
               <w:ind w:left="0"/>
               <w:jc w:val="center"/>
@@ -11403,6 +11821,7 @@
           <w:p>
             <w:pPr>
               <w:pStyle w:val="Prrafodelista"/>
+              <w:widowControl w:val="0"/>
               <w:spacing w:after="0" w:line="240" w:lineRule="auto"/>
               <w:ind w:left="0"/>
               <w:jc w:val="center"/>
@@ -11436,6 +11855,7 @@
           <w:p>
             <w:pPr>
               <w:pStyle w:val="Prrafodelista"/>
+              <w:widowControl w:val="0"/>
               <w:spacing w:after="0" w:line="240" w:lineRule="auto"/>
               <w:ind w:left="0"/>
               <w:jc w:val="center"/>
@@ -11469,6 +11889,7 @@
           <w:p>
             <w:pPr>
               <w:pStyle w:val="Prrafodelista"/>
+              <w:widowControl w:val="0"/>
               <w:spacing w:after="0" w:line="240" w:lineRule="auto"/>
               <w:ind w:left="0"/>
               <w:jc w:val="center"/>
@@ -11509,6 +11930,7 @@
           <w:p>
             <w:pPr>
               <w:pStyle w:val="Prrafodelista"/>
+              <w:widowControl w:val="0"/>
               <w:spacing w:line="360" w:lineRule="auto"/>
               <w:ind w:left="113" w:right="113"/>
               <w:jc w:val="center"/>
@@ -11544,6 +11966,7 @@
           <w:p>
             <w:pPr>
               <w:pStyle w:val="Prrafodelista"/>
+              <w:widowControl w:val="0"/>
               <w:spacing w:after="0" w:line="240" w:lineRule="auto"/>
               <w:ind w:left="0"/>
               <w:jc w:val="center"/>
@@ -11577,6 +12000,7 @@
           <w:p>
             <w:pPr>
               <w:pStyle w:val="Prrafodelista"/>
+              <w:widowControl w:val="0"/>
               <w:spacing w:after="0" w:line="240" w:lineRule="auto"/>
               <w:ind w:left="0"/>
               <w:jc w:val="center"/>
@@ -11610,6 +12034,7 @@
           <w:p>
             <w:pPr>
               <w:pStyle w:val="Prrafodelista"/>
+              <w:widowControl w:val="0"/>
               <w:spacing w:after="0" w:line="240" w:lineRule="auto"/>
               <w:ind w:left="0"/>
               <w:jc w:val="center"/>
@@ -11643,6 +12068,7 @@
           <w:p>
             <w:pPr>
               <w:pStyle w:val="Prrafodelista"/>
+              <w:widowControl w:val="0"/>
               <w:spacing w:after="0" w:line="240" w:lineRule="auto"/>
               <w:ind w:left="0"/>
               <w:jc w:val="center"/>
@@ -11675,6 +12101,7 @@
           </w:tcPr>
           <w:p>
             <w:pPr>
+              <w:widowControl w:val="0"/>
               <w:jc w:val="center"/>
               <w:rPr>
                 <w:rFonts w:cstheme="minorHAnsi"/>
@@ -11706,6 +12133,7 @@
           <w:p>
             <w:pPr>
               <w:pStyle w:val="Prrafodelista"/>
+              <w:widowControl w:val="0"/>
               <w:spacing w:after="0" w:line="240" w:lineRule="auto"/>
               <w:ind w:left="0"/>
               <w:jc w:val="center"/>
@@ -11739,6 +12167,7 @@
           <w:p>
             <w:pPr>
               <w:pStyle w:val="Prrafodelista"/>
+              <w:widowControl w:val="0"/>
               <w:spacing w:after="0" w:line="240" w:lineRule="auto"/>
               <w:ind w:left="0"/>
               <w:jc w:val="center"/>
@@ -11772,6 +12201,7 @@
           <w:p>
             <w:pPr>
               <w:pStyle w:val="Prrafodelista"/>
+              <w:widowControl w:val="0"/>
               <w:spacing w:after="0" w:line="240" w:lineRule="auto"/>
               <w:ind w:left="0"/>
               <w:jc w:val="center"/>
@@ -11813,6 +12243,7 @@
           <w:p>
             <w:pPr>
               <w:pStyle w:val="Prrafodelista"/>
+              <w:widowControl w:val="0"/>
               <w:spacing w:after="0"/>
               <w:ind w:left="0"/>
               <w:jc w:val="center"/>
@@ -11847,6 +12278,7 @@
           <w:p>
             <w:pPr>
               <w:pStyle w:val="Prrafodelista"/>
+              <w:widowControl w:val="0"/>
               <w:spacing w:after="0" w:line="240" w:lineRule="auto"/>
               <w:ind w:left="0"/>
               <w:jc w:val="center"/>
@@ -11882,6 +12314,7 @@
           <w:p>
             <w:pPr>
               <w:pStyle w:val="Prrafodelista"/>
+              <w:widowControl w:val="0"/>
               <w:spacing w:after="0" w:line="240" w:lineRule="auto"/>
               <w:ind w:left="0"/>
               <w:jc w:val="center"/>
@@ -11917,6 +12350,7 @@
           <w:p>
             <w:pPr>
               <w:pStyle w:val="Prrafodelista"/>
+              <w:widowControl w:val="0"/>
               <w:spacing w:after="0" w:line="240" w:lineRule="auto"/>
               <w:ind w:left="0"/>
               <w:jc w:val="center"/>
@@ -11952,6 +12386,7 @@
           <w:p>
             <w:pPr>
               <w:pStyle w:val="Prrafodelista"/>
+              <w:widowControl w:val="0"/>
               <w:spacing w:after="0" w:line="240" w:lineRule="auto"/>
               <w:ind w:left="0"/>
               <w:jc w:val="center"/>
@@ -11987,6 +12422,7 @@
           <w:p>
             <w:pPr>
               <w:pStyle w:val="Prrafodelista"/>
+              <w:widowControl w:val="0"/>
               <w:spacing w:after="0" w:line="240" w:lineRule="auto"/>
               <w:ind w:left="0"/>
               <w:jc w:val="center"/>
@@ -12022,6 +12458,7 @@
           <w:p>
             <w:pPr>
               <w:pStyle w:val="Prrafodelista"/>
+              <w:widowControl w:val="0"/>
               <w:spacing w:after="0" w:line="240" w:lineRule="auto"/>
               <w:ind w:left="0"/>
               <w:jc w:val="center"/>
@@ -12057,6 +12494,7 @@
           <w:p>
             <w:pPr>
               <w:pStyle w:val="Prrafodelista"/>
+              <w:widowControl w:val="0"/>
               <w:spacing w:after="0" w:line="240" w:lineRule="auto"/>
               <w:ind w:left="0"/>
               <w:jc w:val="center"/>
@@ -12092,6 +12530,7 @@
           <w:p>
             <w:pPr>
               <w:pStyle w:val="Prrafodelista"/>
+              <w:widowControl w:val="0"/>
               <w:spacing w:after="0" w:line="240" w:lineRule="auto"/>
               <w:ind w:left="0"/>
               <w:jc w:val="center"/>
@@ -12136,6 +12575,7 @@
           <w:p>
             <w:pPr>
               <w:pStyle w:val="Prrafodelista"/>
+              <w:widowControl w:val="0"/>
               <w:spacing w:after="0" w:line="360" w:lineRule="auto"/>
               <w:ind w:left="113" w:right="113"/>
               <w:jc w:val="center"/>
@@ -12157,6 +12597,7 @@
           <w:p>
             <w:pPr>
               <w:pStyle w:val="Prrafodelista"/>
+              <w:widowControl w:val="0"/>
               <w:spacing w:after="0" w:line="240" w:lineRule="auto"/>
               <w:ind w:left="0"/>
               <w:jc w:val="center"/>
@@ -12194,6 +12635,7 @@
           <w:p>
             <w:pPr>
               <w:pStyle w:val="Prrafodelista"/>
+              <w:widowControl w:val="0"/>
               <w:spacing w:after="0" w:line="240" w:lineRule="auto"/>
               <w:ind w:left="0"/>
               <w:jc w:val="center"/>
@@ -12229,6 +12671,7 @@
           <w:p>
             <w:pPr>
               <w:pStyle w:val="Prrafodelista"/>
+              <w:widowControl w:val="0"/>
               <w:spacing w:after="0" w:line="240" w:lineRule="auto"/>
               <w:ind w:left="0"/>
               <w:jc w:val="center"/>
@@ -12264,6 +12707,7 @@
           <w:p>
             <w:pPr>
               <w:pStyle w:val="Prrafodelista"/>
+              <w:widowControl w:val="0"/>
               <w:spacing w:after="0" w:line="240" w:lineRule="auto"/>
               <w:ind w:left="0"/>
               <w:jc w:val="center"/>
@@ -12299,6 +12743,7 @@
           <w:p>
             <w:pPr>
               <w:pStyle w:val="Prrafodelista"/>
+              <w:widowControl w:val="0"/>
               <w:spacing w:after="0" w:line="240" w:lineRule="auto"/>
               <w:ind w:left="0"/>
               <w:jc w:val="center"/>
@@ -12334,6 +12779,7 @@
           <w:p>
             <w:pPr>
               <w:pStyle w:val="Prrafodelista"/>
+              <w:widowControl w:val="0"/>
               <w:spacing w:after="0" w:line="240" w:lineRule="auto"/>
               <w:ind w:left="0"/>
               <w:jc w:val="center"/>
@@ -12369,6 +12815,7 @@
           <w:p>
             <w:pPr>
               <w:pStyle w:val="Prrafodelista"/>
+              <w:widowControl w:val="0"/>
               <w:spacing w:after="0" w:line="240" w:lineRule="auto"/>
               <w:ind w:left="0"/>
               <w:jc w:val="center"/>
@@ -12404,6 +12851,7 @@
           <w:p>
             <w:pPr>
               <w:pStyle w:val="Prrafodelista"/>
+              <w:widowControl w:val="0"/>
               <w:spacing w:after="0" w:line="240" w:lineRule="auto"/>
               <w:ind w:left="0"/>
               <w:jc w:val="center"/>
@@ -12436,6 +12884,7 @@
     <w:p>
       <w:pPr>
         <w:pStyle w:val="Prrafodelista"/>
+        <w:widowControl w:val="0"/>
         <w:spacing w:after="0"/>
         <w:ind w:left="142"/>
         <w:rPr>
@@ -12457,6 +12906,7 @@
     <w:p>
       <w:pPr>
         <w:pStyle w:val="Prrafodelista"/>
+        <w:widowControl w:val="0"/>
         <w:numPr>
           <w:ilvl w:val="0"/>
           <w:numId w:val="1"/>
@@ -12491,6 +12941,7 @@
     <w:p>
       <w:pPr>
         <w:pStyle w:val="Prrafodelista"/>
+        <w:widowControl w:val="0"/>
         <w:tabs>
           <w:tab w:val="left" w:pos="2940"/>
         </w:tabs>
@@ -12555,6 +13006,7 @@
           <w:p>
             <w:pPr>
               <w:pStyle w:val="Prrafodelista"/>
+              <w:widowControl w:val="0"/>
               <w:spacing w:after="0" w:line="240" w:lineRule="auto"/>
               <w:ind w:left="0"/>
               <w:jc w:val="center"/>
@@ -12591,6 +13043,7 @@
           <w:p>
             <w:pPr>
               <w:pStyle w:val="Prrafodelista"/>
+              <w:widowControl w:val="0"/>
               <w:spacing w:after="0" w:line="240" w:lineRule="auto"/>
               <w:ind w:left="0"/>
               <w:jc w:val="center"/>
@@ -12625,6 +13078,7 @@
           <w:p>
             <w:pPr>
               <w:pStyle w:val="Prrafodelista"/>
+              <w:widowControl w:val="0"/>
               <w:spacing w:after="0" w:line="240" w:lineRule="auto"/>
               <w:ind w:left="0"/>
               <w:jc w:val="center"/>
@@ -12651,6 +13105,7 @@
     <w:p>
       <w:pPr>
         <w:pStyle w:val="Prrafodelista"/>
+        <w:widowControl w:val="0"/>
         <w:tabs>
           <w:tab w:val="left" w:pos="2940"/>
         </w:tabs>
@@ -12717,6 +13172,7 @@
           <w:p>
             <w:pPr>
               <w:pStyle w:val="Prrafodelista"/>
+              <w:widowControl w:val="0"/>
               <w:spacing w:after="0" w:line="240" w:lineRule="auto"/>
               <w:ind w:left="0"/>
               <w:jc w:val="center"/>
@@ -12754,6 +13210,7 @@
           </w:tcPr>
           <w:p>
             <w:pPr>
+              <w:widowControl w:val="0"/>
               <w:autoSpaceDE w:val="0"/>
               <w:autoSpaceDN w:val="0"/>
               <w:adjustRightInd w:val="0"/>
@@ -12789,6 +13246,7 @@
           </w:tcPr>
           <w:p>
             <w:pPr>
+              <w:widowControl w:val="0"/>
               <w:autoSpaceDE w:val="0"/>
               <w:autoSpaceDN w:val="0"/>
               <w:adjustRightInd w:val="0"/>
@@ -12824,6 +13282,7 @@
           </w:tcPr>
           <w:p>
             <w:pPr>
+              <w:widowControl w:val="0"/>
               <w:autoSpaceDE w:val="0"/>
               <w:autoSpaceDN w:val="0"/>
               <w:adjustRightInd w:val="0"/>
@@ -12863,6 +13322,7 @@
           <w:p>
             <w:pPr>
               <w:pStyle w:val="Prrafodelista"/>
+              <w:widowControl w:val="0"/>
               <w:tabs>
                 <w:tab w:val="left" w:pos="2940"/>
               </w:tabs>
@@ -12908,6 +13368,7 @@
           <w:p>
             <w:pPr>
               <w:pStyle w:val="Prrafodelista"/>
+              <w:widowControl w:val="0"/>
               <w:spacing w:after="0" w:line="240" w:lineRule="auto"/>
               <w:ind w:left="0"/>
               <w:jc w:val="center"/>
@@ -12934,6 +13395,7 @@
           </w:tcPr>
           <w:p>
             <w:pPr>
+              <w:widowControl w:val="0"/>
               <w:autoSpaceDE w:val="0"/>
               <w:autoSpaceDN w:val="0"/>
               <w:adjustRightInd w:val="0"/>
@@ -12969,6 +13431,7 @@
           </w:tcPr>
           <w:p>
             <w:pPr>
+              <w:widowControl w:val="0"/>
               <w:autoSpaceDE w:val="0"/>
               <w:autoSpaceDN w:val="0"/>
               <w:adjustRightInd w:val="0"/>
@@ -13005,6 +13468,7 @@
           <w:p>
             <w:pPr>
               <w:pStyle w:val="Prrafodelista"/>
+              <w:widowControl w:val="0"/>
               <w:spacing w:after="0" w:line="240" w:lineRule="auto"/>
               <w:ind w:left="0"/>
               <w:jc w:val="both"/>
@@ -13044,6 +13508,7 @@
           <w:p>
             <w:pPr>
               <w:pStyle w:val="Prrafodelista"/>
+              <w:widowControl w:val="0"/>
               <w:spacing w:after="0" w:line="240" w:lineRule="auto"/>
               <w:ind w:left="0"/>
               <w:jc w:val="both"/>
@@ -13075,6 +13540,7 @@
           <w:p>
             <w:pPr>
               <w:pStyle w:val="Prrafodelista"/>
+              <w:widowControl w:val="0"/>
               <w:spacing w:after="0" w:line="240" w:lineRule="auto"/>
               <w:ind w:left="0"/>
               <w:jc w:val="center"/>
@@ -13101,6 +13567,7 @@
           </w:tcPr>
           <w:p>
             <w:pPr>
+              <w:widowControl w:val="0"/>
               <w:autoSpaceDE w:val="0"/>
               <w:autoSpaceDN w:val="0"/>
               <w:adjustRightInd w:val="0"/>
@@ -13136,6 +13603,7 @@
           </w:tcPr>
           <w:p>
             <w:pPr>
+              <w:widowControl w:val="0"/>
               <w:autoSpaceDE w:val="0"/>
               <w:autoSpaceDN w:val="0"/>
               <w:adjustRightInd w:val="0"/>
@@ -13172,6 +13640,7 @@
           <w:p>
             <w:pPr>
               <w:pStyle w:val="Prrafodelista"/>
+              <w:widowControl w:val="0"/>
               <w:spacing w:after="0" w:line="240" w:lineRule="auto"/>
               <w:ind w:left="0"/>
               <w:jc w:val="both"/>
@@ -13211,6 +13680,7 @@
           <w:p>
             <w:pPr>
               <w:pStyle w:val="Prrafodelista"/>
+              <w:widowControl w:val="0"/>
               <w:spacing w:after="0" w:line="240" w:lineRule="auto"/>
               <w:ind w:left="0"/>
               <w:jc w:val="both"/>
@@ -13242,6 +13712,7 @@
           <w:p>
             <w:pPr>
               <w:pStyle w:val="Prrafodelista"/>
+              <w:widowControl w:val="0"/>
               <w:spacing w:after="0" w:line="240" w:lineRule="auto"/>
               <w:ind w:left="0"/>
               <w:jc w:val="center"/>
@@ -13268,6 +13739,7 @@
           </w:tcPr>
           <w:p>
             <w:pPr>
+              <w:widowControl w:val="0"/>
               <w:autoSpaceDE w:val="0"/>
               <w:autoSpaceDN w:val="0"/>
               <w:adjustRightInd w:val="0"/>
@@ -13303,6 +13775,7 @@
           </w:tcPr>
           <w:p>
             <w:pPr>
+              <w:widowControl w:val="0"/>
               <w:autoSpaceDE w:val="0"/>
               <w:autoSpaceDN w:val="0"/>
               <w:adjustRightInd w:val="0"/>
@@ -13339,6 +13812,7 @@
           <w:p>
             <w:pPr>
               <w:pStyle w:val="Prrafodelista"/>
+              <w:widowControl w:val="0"/>
               <w:spacing w:after="0" w:line="240" w:lineRule="auto"/>
               <w:ind w:left="0"/>
               <w:jc w:val="both"/>
@@ -13378,6 +13852,7 @@
           <w:p>
             <w:pPr>
               <w:pStyle w:val="Prrafodelista"/>
+              <w:widowControl w:val="0"/>
               <w:spacing w:after="0" w:line="240" w:lineRule="auto"/>
               <w:ind w:left="0"/>
               <w:jc w:val="both"/>
@@ -13409,6 +13884,7 @@
           <w:p>
             <w:pPr>
               <w:pStyle w:val="Prrafodelista"/>
+              <w:widowControl w:val="0"/>
               <w:spacing w:after="0" w:line="240" w:lineRule="auto"/>
               <w:ind w:left="0"/>
               <w:jc w:val="center"/>
@@ -13435,6 +13911,7 @@
           </w:tcPr>
           <w:p>
             <w:pPr>
+              <w:widowControl w:val="0"/>
               <w:autoSpaceDE w:val="0"/>
               <w:autoSpaceDN w:val="0"/>
               <w:adjustRightInd w:val="0"/>
@@ -13470,6 +13947,7 @@
           </w:tcPr>
           <w:p>
             <w:pPr>
+              <w:widowControl w:val="0"/>
               <w:autoSpaceDE w:val="0"/>
               <w:autoSpaceDN w:val="0"/>
               <w:adjustRightInd w:val="0"/>
@@ -13506,6 +13984,7 @@
           <w:p>
             <w:pPr>
               <w:pStyle w:val="Prrafodelista"/>
+              <w:widowControl w:val="0"/>
               <w:spacing w:after="0" w:line="240" w:lineRule="auto"/>
               <w:ind w:left="0"/>
               <w:jc w:val="both"/>
@@ -13545,6 +14024,7 @@
           <w:p>
             <w:pPr>
               <w:pStyle w:val="Prrafodelista"/>
+              <w:widowControl w:val="0"/>
               <w:spacing w:after="0" w:line="240" w:lineRule="auto"/>
               <w:ind w:left="0"/>
               <w:jc w:val="both"/>
@@ -13576,6 +14056,7 @@
           <w:p>
             <w:pPr>
               <w:pStyle w:val="Prrafodelista"/>
+              <w:widowControl w:val="0"/>
               <w:spacing w:after="0" w:line="240" w:lineRule="auto"/>
               <w:ind w:left="0"/>
               <w:jc w:val="center"/>
@@ -13602,6 +14083,7 @@
           </w:tcPr>
           <w:p>
             <w:pPr>
+              <w:widowControl w:val="0"/>
               <w:autoSpaceDE w:val="0"/>
               <w:autoSpaceDN w:val="0"/>
               <w:adjustRightInd w:val="0"/>
@@ -13637,6 +14119,7 @@
           </w:tcPr>
           <w:p>
             <w:pPr>
+              <w:widowControl w:val="0"/>
               <w:autoSpaceDE w:val="0"/>
               <w:autoSpaceDN w:val="0"/>
               <w:adjustRightInd w:val="0"/>
@@ -13673,6 +14156,7 @@
           <w:p>
             <w:pPr>
               <w:pStyle w:val="Prrafodelista"/>
+              <w:widowControl w:val="0"/>
               <w:spacing w:after="0" w:line="240" w:lineRule="auto"/>
               <w:ind w:left="0"/>
               <w:jc w:val="both"/>
@@ -13712,6 +14196,7 @@
           <w:p>
             <w:pPr>
               <w:pStyle w:val="Prrafodelista"/>
+              <w:widowControl w:val="0"/>
               <w:spacing w:after="0" w:line="240" w:lineRule="auto"/>
               <w:ind w:left="0"/>
               <w:jc w:val="both"/>
@@ -13729,6 +14214,7 @@
     <w:p>
       <w:pPr>
         <w:pStyle w:val="Prrafodelista"/>
+        <w:widowControl w:val="0"/>
         <w:tabs>
           <w:tab w:val="left" w:pos="2940"/>
         </w:tabs>
@@ -13758,6 +14244,7 @@
     <w:p>
       <w:pPr>
         <w:pStyle w:val="Prrafodelista"/>
+        <w:widowControl w:val="0"/>
         <w:tabs>
           <w:tab w:val="left" w:pos="2940"/>
         </w:tabs>
@@ -13787,6 +14274,7 @@
     <w:p>
       <w:pPr>
         <w:pStyle w:val="Prrafodelista"/>
+        <w:widowControl w:val="0"/>
         <w:spacing w:after="0"/>
         <w:ind w:left="142"/>
         <w:rPr>
@@ -13801,6 +14289,7 @@
     </w:p>
     <w:p>
       <w:pPr>
+        <w:widowControl w:val="0"/>
         <w:rPr>
           <w:rFonts w:ascii="Calibri" w:hAnsi="Calibri" w:cs="Calibri"/>
           <w:b/>
@@ -13820,6 +14309,7 @@
     <w:p>
       <w:pPr>
         <w:pStyle w:val="Prrafodelista"/>
+        <w:widowControl w:val="0"/>
         <w:numPr>
           <w:ilvl w:val="0"/>
           <w:numId w:val="1"/>
@@ -13851,6 +14341,7 @@
     <w:p>
       <w:pPr>
         <w:pStyle w:val="Prrafodelista"/>
+        <w:widowControl w:val="0"/>
         <w:numPr>
           <w:ilvl w:val="1"/>
           <w:numId w:val="1"/>
@@ -13932,6 +14423,7 @@
           <w:p>
             <w:pPr>
               <w:pStyle w:val="Prrafodelista"/>
+              <w:widowControl w:val="0"/>
               <w:spacing w:after="0" w:line="240" w:lineRule="auto"/>
               <w:ind w:left="0"/>
               <w:jc w:val="center"/>
@@ -13968,6 +14460,7 @@
           <w:p>
             <w:pPr>
               <w:pStyle w:val="Prrafodelista"/>
+              <w:widowControl w:val="0"/>
               <w:spacing w:after="0" w:line="240" w:lineRule="auto"/>
               <w:ind w:left="0"/>
               <w:jc w:val="center"/>
@@ -14009,6 +14502,7 @@
           <w:p>
             <w:pPr>
               <w:pStyle w:val="Prrafodelista"/>
+              <w:widowControl w:val="0"/>
               <w:spacing w:after="0" w:line="240" w:lineRule="auto"/>
               <w:ind w:left="0"/>
               <w:jc w:val="center"/>
@@ -14035,6 +14529,7 @@
           <w:p>
             <w:pPr>
               <w:pStyle w:val="Prrafodelista"/>
+              <w:widowControl w:val="0"/>
               <w:spacing w:after="0" w:line="240" w:lineRule="auto"/>
               <w:ind w:left="0"/>
               <w:jc w:val="center"/>
@@ -14069,6 +14564,7 @@
           <w:p>
             <w:pPr>
               <w:pStyle w:val="Prrafodelista"/>
+              <w:widowControl w:val="0"/>
               <w:spacing w:after="0" w:line="240" w:lineRule="auto"/>
               <w:ind w:left="0"/>
               <w:jc w:val="center"/>
@@ -14103,6 +14599,7 @@
           <w:p>
             <w:pPr>
               <w:pStyle w:val="Prrafodelista"/>
+              <w:widowControl w:val="0"/>
               <w:spacing w:after="0" w:line="240" w:lineRule="auto"/>
               <w:ind w:left="0"/>
               <w:jc w:val="center"/>
@@ -14137,6 +14634,7 @@
           <w:p>
             <w:pPr>
               <w:pStyle w:val="Prrafodelista"/>
+              <w:widowControl w:val="0"/>
               <w:spacing w:after="0" w:line="240" w:lineRule="auto"/>
               <w:ind w:left="0"/>
               <w:jc w:val="center"/>
@@ -14171,6 +14669,7 @@
           <w:p>
             <w:pPr>
               <w:pStyle w:val="Prrafodelista"/>
+              <w:widowControl w:val="0"/>
               <w:spacing w:after="0" w:line="240" w:lineRule="auto"/>
               <w:ind w:left="0"/>
               <w:jc w:val="center"/>
@@ -14205,6 +14704,7 @@
           <w:p>
             <w:pPr>
               <w:pStyle w:val="Prrafodelista"/>
+              <w:widowControl w:val="0"/>
               <w:spacing w:after="0" w:line="240" w:lineRule="auto"/>
               <w:ind w:left="0"/>
               <w:jc w:val="center"/>
@@ -14239,6 +14739,7 @@
           <w:p>
             <w:pPr>
               <w:pStyle w:val="Prrafodelista"/>
+              <w:widowControl w:val="0"/>
               <w:spacing w:after="0" w:line="240" w:lineRule="auto"/>
               <w:ind w:left="0"/>
               <w:jc w:val="center"/>
@@ -14273,6 +14774,7 @@
           <w:p>
             <w:pPr>
               <w:pStyle w:val="Prrafodelista"/>
+              <w:widowControl w:val="0"/>
               <w:spacing w:after="0" w:line="240" w:lineRule="auto"/>
               <w:ind w:left="0"/>
               <w:jc w:val="center"/>
@@ -14314,6 +14816,7 @@
           <w:p>
             <w:pPr>
               <w:pStyle w:val="Prrafodelista"/>
+              <w:widowControl w:val="0"/>
               <w:spacing w:after="0" w:line="240" w:lineRule="auto"/>
               <w:ind w:left="0"/>
               <w:rPr>
@@ -14340,6 +14843,7 @@
           <w:p>
             <w:pPr>
               <w:pStyle w:val="Prrafodelista"/>
+              <w:widowControl w:val="0"/>
               <w:spacing w:after="0" w:line="240" w:lineRule="auto"/>
               <w:ind w:left="0"/>
               <w:jc w:val="center"/>
@@ -14382,6 +14886,7 @@
           <w:p>
             <w:pPr>
               <w:pStyle w:val="Prrafodelista"/>
+              <w:widowControl w:val="0"/>
               <w:spacing w:after="0" w:line="240" w:lineRule="auto"/>
               <w:ind w:left="0"/>
               <w:jc w:val="center"/>
@@ -14424,6 +14929,7 @@
           <w:p>
             <w:pPr>
               <w:pStyle w:val="Prrafodelista"/>
+              <w:widowControl w:val="0"/>
               <w:spacing w:after="0" w:line="240" w:lineRule="auto"/>
               <w:ind w:left="0"/>
               <w:jc w:val="center"/>
@@ -14466,6 +14972,7 @@
           <w:p>
             <w:pPr>
               <w:pStyle w:val="Prrafodelista"/>
+              <w:widowControl w:val="0"/>
               <w:spacing w:after="0" w:line="240" w:lineRule="auto"/>
               <w:ind w:left="0"/>
               <w:jc w:val="center"/>
@@ -14508,6 +15015,7 @@
           <w:p>
             <w:pPr>
               <w:pStyle w:val="Prrafodelista"/>
+              <w:widowControl w:val="0"/>
               <w:spacing w:after="0" w:line="240" w:lineRule="auto"/>
               <w:ind w:left="0"/>
               <w:jc w:val="center"/>
@@ -14550,6 +15058,7 @@
           <w:p>
             <w:pPr>
               <w:pStyle w:val="Prrafodelista"/>
+              <w:widowControl w:val="0"/>
               <w:spacing w:after="0" w:line="240" w:lineRule="auto"/>
               <w:ind w:left="0"/>
               <w:jc w:val="center"/>
@@ -14592,6 +15101,7 @@
           <w:p>
             <w:pPr>
               <w:pStyle w:val="Prrafodelista"/>
+              <w:widowControl w:val="0"/>
               <w:spacing w:after="0" w:line="240" w:lineRule="auto"/>
               <w:ind w:left="0"/>
               <w:jc w:val="center"/>
@@ -14634,6 +15144,7 @@
           <w:p>
             <w:pPr>
               <w:pStyle w:val="Prrafodelista"/>
+              <w:widowControl w:val="0"/>
               <w:spacing w:after="0" w:line="240" w:lineRule="auto"/>
               <w:ind w:left="0"/>
               <w:jc w:val="center"/>
@@ -14679,6 +15190,7 @@
           </w:tcPr>
           <w:p>
             <w:pPr>
+              <w:widowControl w:val="0"/>
               <w:rPr>
                 <w:rFonts w:cstheme="minorHAnsi"/>
                 <w:b/>
@@ -14706,6 +15218,7 @@
           </w:p>
           <w:p>
             <w:pPr>
+              <w:widowControl w:val="0"/>
               <w:rPr>
                 <w:rFonts w:cstheme="minorHAnsi"/>
                 <w:i/>
@@ -14742,6 +15255,7 @@
           </w:tcPr>
           <w:p>
             <w:pPr>
+              <w:widowControl w:val="0"/>
               <w:jc w:val="center"/>
               <w:rPr>
                 <w:rFonts w:cstheme="minorHAnsi"/>
@@ -14778,6 +15292,7 @@
           <w:p>
             <w:pPr>
               <w:pStyle w:val="Prrafodelista"/>
+              <w:widowControl w:val="0"/>
               <w:spacing w:line="240" w:lineRule="auto"/>
               <w:ind w:left="0"/>
               <w:jc w:val="center"/>
@@ -14820,6 +15335,7 @@
           <w:p>
             <w:pPr>
               <w:pStyle w:val="Prrafodelista"/>
+              <w:widowControl w:val="0"/>
               <w:spacing w:line="240" w:lineRule="auto"/>
               <w:ind w:left="0"/>
               <w:jc w:val="center"/>
@@ -14862,6 +15378,7 @@
           <w:p>
             <w:pPr>
               <w:pStyle w:val="Prrafodelista"/>
+              <w:widowControl w:val="0"/>
               <w:spacing w:line="240" w:lineRule="auto"/>
               <w:ind w:left="0"/>
               <w:jc w:val="center"/>
@@ -14904,6 +15421,7 @@
           <w:p>
             <w:pPr>
               <w:pStyle w:val="Prrafodelista"/>
+              <w:widowControl w:val="0"/>
               <w:spacing w:line="240" w:lineRule="auto"/>
               <w:ind w:left="0"/>
               <w:jc w:val="center"/>
@@ -14946,6 +15464,7 @@
           <w:p>
             <w:pPr>
               <w:pStyle w:val="Prrafodelista"/>
+              <w:widowControl w:val="0"/>
               <w:spacing w:line="240" w:lineRule="auto"/>
               <w:ind w:left="0"/>
               <w:jc w:val="center"/>
@@ -14988,6 +15507,7 @@
           <w:p>
             <w:pPr>
               <w:pStyle w:val="Prrafodelista"/>
+              <w:widowControl w:val="0"/>
               <w:spacing w:after="0" w:line="240" w:lineRule="auto"/>
               <w:ind w:left="0"/>
               <w:jc w:val="center"/>
@@ -15029,6 +15549,7 @@
           </w:tcPr>
           <w:p>
             <w:pPr>
+              <w:widowControl w:val="0"/>
               <w:jc w:val="center"/>
               <w:rPr>
                 <w:rFonts w:cstheme="minorHAnsi"/>
@@ -15056,6 +15577,7 @@
     </w:tbl>
     <w:p>
       <w:pPr>
+        <w:widowControl w:val="0"/>
         <w:rPr>
           <w:rFonts w:ascii="Calibri" w:hAnsi="Calibri" w:cs="Calibri"/>
           <w:b/>
@@ -15075,6 +15597,7 @@
     <w:p>
       <w:pPr>
         <w:pStyle w:val="Prrafodelista"/>
+        <w:widowControl w:val="0"/>
         <w:numPr>
           <w:ilvl w:val="1"/>
           <w:numId w:val="2"/>
@@ -15146,6 +15669,7 @@
           </w:tcPr>
           <w:p>
             <w:pPr>
+              <w:widowControl w:val="0"/>
               <w:rPr>
                 <w:rFonts w:ascii="Magic Mushroom" w:hAnsi="Magic Mushroom" w:cs="Times New Roman"/>
                 <w:bCs/>
@@ -15179,6 +15703,7 @@
           <w:p>
             <w:pPr>
               <w:pStyle w:val="Prrafodelista"/>
+              <w:widowControl w:val="0"/>
               <w:spacing w:after="0" w:line="240" w:lineRule="auto"/>
               <w:ind w:left="0"/>
               <w:jc w:val="center"/>
@@ -15216,6 +15741,7 @@
           </w:tcPr>
           <w:p>
             <w:pPr>
+              <w:widowControl w:val="0"/>
               <w:rPr>
                 <w:rFonts w:cstheme="minorHAnsi"/>
                 <w:i/>
@@ -15238,6 +15764,7 @@
           <w:p>
             <w:pPr>
               <w:pStyle w:val="Prrafodelista"/>
+              <w:widowControl w:val="0"/>
               <w:spacing w:after="0" w:line="240" w:lineRule="auto"/>
               <w:ind w:left="0"/>
               <w:jc w:val="center"/>
@@ -15268,6 +15795,7 @@
           <w:p>
             <w:pPr>
               <w:pStyle w:val="Prrafodelista"/>
+              <w:widowControl w:val="0"/>
               <w:spacing w:after="0" w:line="240" w:lineRule="auto"/>
               <w:ind w:left="0"/>
               <w:jc w:val="center"/>
@@ -15298,6 +15826,7 @@
           <w:p>
             <w:pPr>
               <w:pStyle w:val="Prrafodelista"/>
+              <w:widowControl w:val="0"/>
               <w:spacing w:after="0" w:line="240" w:lineRule="auto"/>
               <w:ind w:left="0"/>
               <w:jc w:val="center"/>
@@ -15328,6 +15857,7 @@
           <w:p>
             <w:pPr>
               <w:pStyle w:val="Prrafodelista"/>
+              <w:widowControl w:val="0"/>
               <w:spacing w:after="0" w:line="240" w:lineRule="auto"/>
               <w:ind w:left="0"/>
               <w:jc w:val="center"/>
@@ -15358,6 +15888,7 @@
           <w:p>
             <w:pPr>
               <w:pStyle w:val="Prrafodelista"/>
+              <w:widowControl w:val="0"/>
               <w:spacing w:after="0" w:line="240" w:lineRule="auto"/>
               <w:ind w:left="0"/>
               <w:jc w:val="center"/>
@@ -15388,6 +15919,7 @@
           <w:p>
             <w:pPr>
               <w:pStyle w:val="Prrafodelista"/>
+              <w:widowControl w:val="0"/>
               <w:spacing w:after="0" w:line="240" w:lineRule="auto"/>
               <w:ind w:left="0"/>
               <w:jc w:val="center"/>
@@ -15418,6 +15950,7 @@
           <w:p>
             <w:pPr>
               <w:pStyle w:val="Prrafodelista"/>
+              <w:widowControl w:val="0"/>
               <w:spacing w:after="0" w:line="240" w:lineRule="auto"/>
               <w:ind w:left="0"/>
               <w:jc w:val="center"/>
@@ -15448,6 +15981,7 @@
           <w:p>
             <w:pPr>
               <w:pStyle w:val="Prrafodelista"/>
+              <w:widowControl w:val="0"/>
               <w:spacing w:after="0" w:line="240" w:lineRule="auto"/>
               <w:ind w:left="0"/>
               <w:jc w:val="center"/>
@@ -15484,6 +16018,7 @@
           </w:tcPr>
           <w:p>
             <w:pPr>
+              <w:widowControl w:val="0"/>
               <w:rPr>
                 <w:rFonts w:cstheme="minorHAnsi"/>
                 <w:i/>
@@ -15515,6 +16050,7 @@
           <w:p>
             <w:pPr>
               <w:pStyle w:val="Prrafodelista"/>
+              <w:widowControl w:val="0"/>
               <w:spacing w:after="0" w:line="240" w:lineRule="auto"/>
               <w:ind w:left="0"/>
               <w:jc w:val="center"/>
@@ -15553,6 +16089,7 @@
           <w:p>
             <w:pPr>
               <w:pStyle w:val="Prrafodelista"/>
+              <w:widowControl w:val="0"/>
               <w:spacing w:after="0" w:line="240" w:lineRule="auto"/>
               <w:ind w:left="0"/>
               <w:jc w:val="center"/>
@@ -15591,6 +16128,7 @@
           <w:p>
             <w:pPr>
               <w:pStyle w:val="Prrafodelista"/>
+              <w:widowControl w:val="0"/>
               <w:spacing w:after="0" w:line="240" w:lineRule="auto"/>
               <w:ind w:left="0"/>
               <w:jc w:val="center"/>
@@ -15629,6 +16167,7 @@
           <w:p>
             <w:pPr>
               <w:pStyle w:val="Prrafodelista"/>
+              <w:widowControl w:val="0"/>
               <w:spacing w:after="0" w:line="240" w:lineRule="auto"/>
               <w:ind w:left="0"/>
               <w:jc w:val="center"/>
@@ -15667,6 +16206,7 @@
           <w:p>
             <w:pPr>
               <w:pStyle w:val="Prrafodelista"/>
+              <w:widowControl w:val="0"/>
               <w:spacing w:after="0" w:line="240" w:lineRule="auto"/>
               <w:ind w:left="0"/>
               <w:jc w:val="center"/>
@@ -15705,6 +16245,7 @@
           <w:p>
             <w:pPr>
               <w:pStyle w:val="Prrafodelista"/>
+              <w:widowControl w:val="0"/>
               <w:spacing w:after="0" w:line="240" w:lineRule="auto"/>
               <w:ind w:left="0"/>
               <w:jc w:val="center"/>
@@ -15743,6 +16284,7 @@
           <w:p>
             <w:pPr>
               <w:pStyle w:val="Prrafodelista"/>
+              <w:widowControl w:val="0"/>
               <w:spacing w:after="0" w:line="240" w:lineRule="auto"/>
               <w:ind w:left="0"/>
               <w:jc w:val="center"/>
@@ -15781,6 +16323,7 @@
           <w:p>
             <w:pPr>
               <w:pStyle w:val="Prrafodelista"/>
+              <w:widowControl w:val="0"/>
               <w:spacing w:after="0" w:line="240" w:lineRule="auto"/>
               <w:ind w:left="0"/>
               <w:jc w:val="center"/>
@@ -15822,6 +16365,7 @@
           </w:tcPr>
           <w:p>
             <w:pPr>
+              <w:widowControl w:val="0"/>
               <w:rPr>
                 <w:rFonts w:cstheme="minorHAnsi"/>
                 <w:i/>
@@ -15853,6 +16397,7 @@
           <w:p>
             <w:pPr>
               <w:pStyle w:val="Prrafodelista"/>
+              <w:widowControl w:val="0"/>
               <w:spacing w:after="0" w:line="240" w:lineRule="auto"/>
               <w:ind w:left="0"/>
               <w:jc w:val="center"/>
@@ -15891,6 +16436,7 @@
           <w:p>
             <w:pPr>
               <w:pStyle w:val="Prrafodelista"/>
+              <w:widowControl w:val="0"/>
               <w:spacing w:after="0" w:line="240" w:lineRule="auto"/>
               <w:ind w:left="0"/>
               <w:jc w:val="center"/>
@@ -15929,6 +16475,7 @@
           <w:p>
             <w:pPr>
               <w:pStyle w:val="Prrafodelista"/>
+              <w:widowControl w:val="0"/>
               <w:spacing w:after="0" w:line="240" w:lineRule="auto"/>
               <w:ind w:left="0"/>
               <w:jc w:val="center"/>
@@ -15967,6 +16514,7 @@
           <w:p>
             <w:pPr>
               <w:pStyle w:val="Prrafodelista"/>
+              <w:widowControl w:val="0"/>
               <w:spacing w:after="0" w:line="240" w:lineRule="auto"/>
               <w:ind w:left="0"/>
               <w:jc w:val="center"/>
@@ -16005,6 +16553,7 @@
           <w:p>
             <w:pPr>
               <w:pStyle w:val="Prrafodelista"/>
+              <w:widowControl w:val="0"/>
               <w:spacing w:after="0" w:line="240" w:lineRule="auto"/>
               <w:ind w:left="0"/>
               <w:jc w:val="center"/>
@@ -16043,6 +16592,7 @@
           <w:p>
             <w:pPr>
               <w:pStyle w:val="Prrafodelista"/>
+              <w:widowControl w:val="0"/>
               <w:spacing w:after="0" w:line="240" w:lineRule="auto"/>
               <w:ind w:left="0"/>
               <w:jc w:val="center"/>
@@ -16081,6 +16631,7 @@
           <w:p>
             <w:pPr>
               <w:pStyle w:val="Prrafodelista"/>
+              <w:widowControl w:val="0"/>
               <w:spacing w:after="0" w:line="240" w:lineRule="auto"/>
               <w:ind w:left="0"/>
               <w:jc w:val="center"/>
@@ -16119,6 +16670,7 @@
           <w:p>
             <w:pPr>
               <w:pStyle w:val="Prrafodelista"/>
+              <w:widowControl w:val="0"/>
               <w:spacing w:after="0" w:line="240" w:lineRule="auto"/>
               <w:ind w:left="0"/>
               <w:jc w:val="center"/>
@@ -16153,6 +16705,7 @@
     <w:p>
       <w:pPr>
         <w:pStyle w:val="Prrafodelista"/>
+        <w:widowControl w:val="0"/>
         <w:numPr>
           <w:ilvl w:val="1"/>
           <w:numId w:val="2"/>
@@ -16222,6 +16775,7 @@
           </w:tcPr>
           <w:p>
             <w:pPr>
+              <w:widowControl w:val="0"/>
               <w:jc w:val="center"/>
               <w:rPr>
                 <w:rFonts w:ascii="Magic Mushroom" w:hAnsi="Magic Mushroom" w:cs="Times New Roman"/>
@@ -16257,6 +16811,7 @@
           <w:p>
             <w:pPr>
               <w:pStyle w:val="Prrafodelista"/>
+              <w:widowControl w:val="0"/>
               <w:spacing w:after="0" w:line="240" w:lineRule="auto"/>
               <w:ind w:left="0"/>
               <w:jc w:val="center"/>
@@ -16295,6 +16850,7 @@
           </w:tcPr>
           <w:p>
             <w:pPr>
+              <w:widowControl w:val="0"/>
               <w:jc w:val="center"/>
               <w:rPr>
                 <w:rFonts w:cstheme="minorHAnsi"/>
@@ -16321,6 +16877,7 @@
           <w:p>
             <w:pPr>
               <w:pStyle w:val="Prrafodelista"/>
+              <w:widowControl w:val="0"/>
               <w:spacing w:after="0" w:line="240" w:lineRule="auto"/>
               <w:ind w:left="0"/>
               <w:jc w:val="center"/>
@@ -16357,6 +16914,7 @@
           <w:p>
             <w:pPr>
               <w:pStyle w:val="Prrafodelista"/>
+              <w:widowControl w:val="0"/>
               <w:spacing w:after="0" w:line="240" w:lineRule="auto"/>
               <w:ind w:left="0"/>
               <w:jc w:val="center"/>
@@ -16393,6 +16951,7 @@
           <w:p>
             <w:pPr>
               <w:pStyle w:val="Prrafodelista"/>
+              <w:widowControl w:val="0"/>
               <w:spacing w:after="0" w:line="240" w:lineRule="auto"/>
               <w:ind w:left="0"/>
               <w:jc w:val="center"/>
@@ -16429,6 +16988,7 @@
           <w:p>
             <w:pPr>
               <w:pStyle w:val="Prrafodelista"/>
+              <w:widowControl w:val="0"/>
               <w:spacing w:after="0" w:line="240" w:lineRule="auto"/>
               <w:ind w:left="0"/>
               <w:jc w:val="center"/>
@@ -16465,6 +17025,7 @@
           <w:p>
             <w:pPr>
               <w:pStyle w:val="Prrafodelista"/>
+              <w:widowControl w:val="0"/>
               <w:spacing w:after="0" w:line="240" w:lineRule="auto"/>
               <w:ind w:left="0"/>
               <w:jc w:val="center"/>
@@ -16497,6 +17058,7 @@
           <w:p>
             <w:pPr>
               <w:pStyle w:val="Prrafodelista"/>
+              <w:widowControl w:val="0"/>
               <w:spacing w:after="0" w:line="240" w:lineRule="auto"/>
               <w:ind w:left="0"/>
               <w:jc w:val="center"/>
@@ -16529,6 +17091,7 @@
           <w:p>
             <w:pPr>
               <w:pStyle w:val="Prrafodelista"/>
+              <w:widowControl w:val="0"/>
               <w:spacing w:after="0" w:line="240" w:lineRule="auto"/>
               <w:ind w:left="0"/>
               <w:jc w:val="center"/>
@@ -16566,6 +17129,7 @@
           <w:p>
             <w:pPr>
               <w:pStyle w:val="Prrafodelista"/>
+              <w:widowControl w:val="0"/>
               <w:spacing w:after="0" w:line="240" w:lineRule="auto"/>
               <w:ind w:left="0"/>
               <w:jc w:val="center"/>
@@ -16603,6 +17167,7 @@
           </w:tcPr>
           <w:p>
             <w:pPr>
+              <w:widowControl w:val="0"/>
               <w:rPr>
                 <w:rFonts w:cstheme="minorHAnsi"/>
                 <w:i/>
@@ -16638,6 +17203,7 @@
           <w:p>
             <w:pPr>
               <w:pStyle w:val="Prrafodelista"/>
+              <w:widowControl w:val="0"/>
               <w:spacing w:after="0" w:line="240" w:lineRule="auto"/>
               <w:ind w:left="0"/>
               <w:jc w:val="center"/>
@@ -16680,6 +17246,7 @@
           <w:p>
             <w:pPr>
               <w:pStyle w:val="Prrafodelista"/>
+              <w:widowControl w:val="0"/>
               <w:spacing w:after="0" w:line="240" w:lineRule="auto"/>
               <w:ind w:left="0"/>
               <w:jc w:val="center"/>
@@ -16722,6 +17289,7 @@
           <w:p>
             <w:pPr>
               <w:pStyle w:val="Prrafodelista"/>
+              <w:widowControl w:val="0"/>
               <w:spacing w:after="0" w:line="240" w:lineRule="auto"/>
               <w:ind w:left="0"/>
               <w:jc w:val="center"/>
@@ -16764,6 +17332,7 @@
           <w:p>
             <w:pPr>
               <w:pStyle w:val="Prrafodelista"/>
+              <w:widowControl w:val="0"/>
               <w:spacing w:after="0" w:line="240" w:lineRule="auto"/>
               <w:ind w:left="0"/>
               <w:jc w:val="center"/>
@@ -16806,6 +17375,7 @@
           <w:p>
             <w:pPr>
               <w:pStyle w:val="Prrafodelista"/>
+              <w:widowControl w:val="0"/>
               <w:spacing w:after="0" w:line="240" w:lineRule="auto"/>
               <w:ind w:left="0"/>
               <w:jc w:val="center"/>
@@ -16848,6 +17418,7 @@
           <w:p>
             <w:pPr>
               <w:pStyle w:val="Prrafodelista"/>
+              <w:widowControl w:val="0"/>
               <w:spacing w:after="0" w:line="240" w:lineRule="auto"/>
               <w:ind w:left="0"/>
               <w:jc w:val="center"/>
@@ -16890,6 +17461,7 @@
           <w:p>
             <w:pPr>
               <w:pStyle w:val="Prrafodelista"/>
+              <w:widowControl w:val="0"/>
               <w:spacing w:after="0" w:line="240" w:lineRule="auto"/>
               <w:ind w:left="0"/>
               <w:jc w:val="center"/>
@@ -16933,6 +17505,7 @@
           <w:p>
             <w:pPr>
               <w:pStyle w:val="Prrafodelista"/>
+              <w:widowControl w:val="0"/>
               <w:spacing w:after="0" w:line="240" w:lineRule="auto"/>
               <w:ind w:left="0"/>
               <w:jc w:val="center"/>
@@ -16994,6 +17567,7 @@
     </w:tbl>
     <w:p>
       <w:pPr>
+        <w:widowControl w:val="0"/>
         <w:rPr>
           <w:rFonts w:ascii="Calibri" w:hAnsi="Calibri" w:cs="Calibri"/>
           <w:b/>
@@ -17013,6 +17587,7 @@
     <w:p>
       <w:pPr>
         <w:pStyle w:val="Prrafodelista"/>
+        <w:widowControl w:val="0"/>
         <w:numPr>
           <w:ilvl w:val="0"/>
           <w:numId w:val="1"/>
@@ -17081,6 +17656,7 @@
           <w:p>
             <w:pPr>
               <w:pStyle w:val="Prrafodelista"/>
+              <w:widowControl w:val="0"/>
               <w:spacing w:after="0" w:line="240" w:lineRule="auto"/>
               <w:ind w:left="0"/>
               <w:jc w:val="center"/>
@@ -17117,6 +17693,7 @@
           <w:p>
             <w:pPr>
               <w:pStyle w:val="Prrafodelista"/>
+              <w:widowControl w:val="0"/>
               <w:spacing w:after="0" w:line="240" w:lineRule="auto"/>
               <w:ind w:left="0"/>
               <w:jc w:val="center"/>
@@ -17153,6 +17730,7 @@
           <w:p>
             <w:pPr>
               <w:pStyle w:val="Prrafodelista"/>
+              <w:widowControl w:val="0"/>
               <w:spacing w:after="0" w:line="240" w:lineRule="auto"/>
               <w:ind w:left="0"/>
               <w:jc w:val="center"/>
@@ -17188,6 +17766,7 @@
           <w:p>
             <w:pPr>
               <w:pStyle w:val="Prrafodelista"/>
+              <w:widowControl w:val="0"/>
               <w:spacing w:after="0" w:line="240" w:lineRule="auto"/>
               <w:ind w:left="0"/>
               <w:jc w:val="center"/>
@@ -17223,6 +17802,7 @@
           <w:p>
             <w:pPr>
               <w:pStyle w:val="Prrafodelista"/>
+              <w:widowControl w:val="0"/>
               <w:spacing w:after="0" w:line="240" w:lineRule="auto"/>
               <w:ind w:left="0"/>
               <w:jc w:val="center"/>
@@ -17258,6 +17838,7 @@
           <w:p>
             <w:pPr>
               <w:pStyle w:val="Prrafodelista"/>
+              <w:widowControl w:val="0"/>
               <w:numPr>
                 <w:ilvl w:val="0"/>
                 <w:numId w:val="3"/>
@@ -17288,6 +17869,7 @@
           <w:p>
             <w:pPr>
               <w:pStyle w:val="Prrafodelista"/>
+              <w:widowControl w:val="0"/>
               <w:numPr>
                 <w:ilvl w:val="0"/>
                 <w:numId w:val="3"/>
@@ -17342,6 +17924,7 @@
           <w:p>
             <w:pPr>
               <w:pStyle w:val="Prrafodelista"/>
+              <w:widowControl w:val="0"/>
               <w:numPr>
                 <w:ilvl w:val="0"/>
                 <w:numId w:val="3"/>
@@ -17381,6 +17964,7 @@
           <w:p>
             <w:pPr>
               <w:pStyle w:val="Prrafodelista"/>
+              <w:widowControl w:val="0"/>
               <w:numPr>
                 <w:ilvl w:val="0"/>
                 <w:numId w:val="3"/>
@@ -17411,6 +17995,7 @@
           <w:p>
             <w:pPr>
               <w:pStyle w:val="Prrafodelista"/>
+              <w:widowControl w:val="0"/>
               <w:numPr>
                 <w:ilvl w:val="0"/>
                 <w:numId w:val="3"/>
@@ -17465,6 +18050,7 @@
           <w:p>
             <w:pPr>
               <w:pStyle w:val="Prrafodelista"/>
+              <w:widowControl w:val="0"/>
               <w:numPr>
                 <w:ilvl w:val="0"/>
                 <w:numId w:val="3"/>
@@ -17503,6 +18089,7 @@
           </w:tcPr>
           <w:p>
             <w:pPr>
+              <w:widowControl w:val="0"/>
               <w:numPr>
                 <w:ilvl w:val="0"/>
                 <w:numId w:val="3"/>
@@ -17535,6 +18122,7 @@
           </w:p>
           <w:p>
             <w:pPr>
+              <w:widowControl w:val="0"/>
               <w:numPr>
                 <w:ilvl w:val="0"/>
                 <w:numId w:val="3"/>
@@ -17595,6 +18183,7 @@
           </w:p>
           <w:p>
             <w:pPr>
+              <w:widowControl w:val="0"/>
               <w:numPr>
                 <w:ilvl w:val="0"/>
                 <w:numId w:val="3"/>
@@ -17637,6 +18226,7 @@
           <w:p>
             <w:pPr>
               <w:pStyle w:val="Prrafodelista"/>
+              <w:widowControl w:val="0"/>
               <w:numPr>
                 <w:ilvl w:val="0"/>
                 <w:numId w:val="3"/>
@@ -17667,6 +18257,7 @@
           <w:p>
             <w:pPr>
               <w:pStyle w:val="Prrafodelista"/>
+              <w:widowControl w:val="0"/>
               <w:numPr>
                 <w:ilvl w:val="0"/>
                 <w:numId w:val="3"/>
@@ -17721,6 +18312,7 @@
           <w:p>
             <w:pPr>
               <w:pStyle w:val="Prrafodelista"/>
+              <w:widowControl w:val="0"/>
               <w:numPr>
                 <w:ilvl w:val="0"/>
                 <w:numId w:val="3"/>
@@ -17751,6 +18343,7 @@
           <w:p>
             <w:pPr>
               <w:pStyle w:val="Prrafodelista"/>
+              <w:widowControl w:val="0"/>
               <w:numPr>
                 <w:ilvl w:val="0"/>
                 <w:numId w:val="3"/>
@@ -17781,6 +18374,7 @@
           <w:p>
             <w:pPr>
               <w:pStyle w:val="Prrafodelista"/>
+              <w:widowControl w:val="0"/>
               <w:numPr>
                 <w:ilvl w:val="0"/>
                 <w:numId w:val="3"/>
@@ -17835,6 +18429,7 @@
           <w:p>
             <w:pPr>
               <w:pStyle w:val="Prrafodelista"/>
+              <w:widowControl w:val="0"/>
               <w:numPr>
                 <w:ilvl w:val="0"/>
                 <w:numId w:val="3"/>
@@ -17865,6 +18460,7 @@
           <w:p>
             <w:pPr>
               <w:pStyle w:val="Prrafodelista"/>
+              <w:widowControl w:val="0"/>
               <w:numPr>
                 <w:ilvl w:val="0"/>
                 <w:numId w:val="3"/>
@@ -17895,6 +18491,7 @@
           <w:p>
             <w:pPr>
               <w:pStyle w:val="Prrafodelista"/>
+              <w:widowControl w:val="0"/>
               <w:numPr>
                 <w:ilvl w:val="0"/>
                 <w:numId w:val="3"/>
@@ -17949,6 +18546,7 @@
           <w:p>
             <w:pPr>
               <w:pStyle w:val="Prrafodelista"/>
+              <w:widowControl w:val="0"/>
               <w:numPr>
                 <w:ilvl w:val="0"/>
                 <w:numId w:val="3"/>
@@ -17988,6 +18586,7 @@
           </w:tcPr>
           <w:p>
             <w:pPr>
+              <w:widowControl w:val="0"/>
               <w:numPr>
                 <w:ilvl w:val="0"/>
                 <w:numId w:val="3"/>
@@ -18020,6 +18619,7 @@
           </w:p>
           <w:p>
             <w:pPr>
+              <w:widowControl w:val="0"/>
               <w:numPr>
                 <w:ilvl w:val="0"/>
                 <w:numId w:val="3"/>
@@ -18080,6 +18680,7 @@
           </w:p>
           <w:p>
             <w:pPr>
+              <w:widowControl w:val="0"/>
               <w:numPr>
                 <w:ilvl w:val="0"/>
                 <w:numId w:val="3"/>
@@ -18116,6 +18717,7 @@
     <w:p>
       <w:pPr>
         <w:pStyle w:val="Prrafodelista"/>
+        <w:widowControl w:val="0"/>
         <w:spacing w:after="0" w:line="360" w:lineRule="auto"/>
         <w:ind w:left="426"/>
         <w:rPr>
@@ -18130,6 +18732,7 @@
     <w:p>
       <w:pPr>
         <w:pStyle w:val="Prrafodelista"/>
+        <w:widowControl w:val="0"/>
         <w:numPr>
           <w:ilvl w:val="0"/>
           <w:numId w:val="1"/>
@@ -18159,6 +18762,7 @@
     <w:p>
       <w:pPr>
         <w:pStyle w:val="Prrafodelista"/>
+        <w:widowControl w:val="0"/>
         <w:numPr>
           <w:ilvl w:val="0"/>
           <w:numId w:val="3"/>
@@ -18190,6 +18794,7 @@
     <w:p>
       <w:pPr>
         <w:pStyle w:val="Prrafodelista"/>
+        <w:widowControl w:val="0"/>
         <w:numPr>
           <w:ilvl w:val="0"/>
           <w:numId w:val="3"/>
@@ -18221,6 +18826,7 @@
     <w:p>
       <w:pPr>
         <w:pStyle w:val="Prrafodelista"/>
+        <w:widowControl w:val="0"/>
         <w:numPr>
           <w:ilvl w:val="0"/>
           <w:numId w:val="3"/>
@@ -18252,6 +18858,7 @@
     <w:p>
       <w:pPr>
         <w:pStyle w:val="Prrafodelista"/>
+        <w:widowControl w:val="0"/>
         <w:numPr>
           <w:ilvl w:val="0"/>
           <w:numId w:val="3"/>
@@ -18283,6 +18890,7 @@
     <w:p>
       <w:pPr>
         <w:pStyle w:val="Prrafodelista"/>
+        <w:widowControl w:val="0"/>
         <w:numPr>
           <w:ilvl w:val="0"/>
           <w:numId w:val="3"/>
@@ -18314,6 +18922,7 @@
     <w:p>
       <w:pPr>
         <w:pStyle w:val="Prrafodelista"/>
+        <w:widowControl w:val="0"/>
         <w:numPr>
           <w:ilvl w:val="0"/>
           <w:numId w:val="3"/>
@@ -18345,6 +18954,7 @@
     <w:p>
       <w:pPr>
         <w:pStyle w:val="Prrafodelista"/>
+        <w:widowControl w:val="0"/>
         <w:numPr>
           <w:ilvl w:val="0"/>
           <w:numId w:val="3"/>
@@ -18376,6 +18986,7 @@
     <w:p>
       <w:pPr>
         <w:pStyle w:val="Prrafodelista"/>
+        <w:widowControl w:val="0"/>
         <w:spacing w:after="0" w:line="240" w:lineRule="auto"/>
         <w:ind w:left="426"/>
         <w:rPr>
@@ -18390,6 +19001,7 @@
     <w:p>
       <w:pPr>
         <w:pStyle w:val="Prrafodelista"/>
+        <w:widowControl w:val="0"/>
         <w:numPr>
           <w:ilvl w:val="0"/>
           <w:numId w:val="1"/>
@@ -18419,6 +19031,7 @@
     <w:p>
       <w:pPr>
         <w:pStyle w:val="Prrafodelista"/>
+        <w:widowControl w:val="0"/>
         <w:numPr>
           <w:ilvl w:val="0"/>
           <w:numId w:val="4"/>
@@ -18448,6 +19061,7 @@
     <w:p>
       <w:pPr>
         <w:pStyle w:val="Prrafodelista"/>
+        <w:widowControl w:val="0"/>
         <w:numPr>
           <w:ilvl w:val="0"/>
           <w:numId w:val="4"/>
@@ -18501,6 +19115,7 @@
     <w:p>
       <w:pPr>
         <w:pStyle w:val="Prrafodelista"/>
+        <w:widowControl w:val="0"/>
         <w:numPr>
           <w:ilvl w:val="0"/>
           <w:numId w:val="4"/>
@@ -18530,6 +19145,7 @@
     <w:p>
       <w:pPr>
         <w:pStyle w:val="Prrafodelista"/>
+        <w:widowControl w:val="0"/>
         <w:ind w:left="426"/>
         <w:rPr>
           <w:b/>
@@ -18543,6 +19159,7 @@
     <w:p>
       <w:pPr>
         <w:pStyle w:val="Prrafodelista"/>
+        <w:widowControl w:val="0"/>
         <w:numPr>
           <w:ilvl w:val="0"/>
           <w:numId w:val="1"/>
@@ -18572,6 +19189,7 @@
     <w:p>
       <w:pPr>
         <w:pStyle w:val="Prrafodelista"/>
+        <w:widowControl w:val="0"/>
         <w:numPr>
           <w:ilvl w:val="0"/>
           <w:numId w:val="4"/>
@@ -18601,6 +19219,7 @@
     <w:p>
       <w:pPr>
         <w:pStyle w:val="Prrafodelista"/>
+        <w:widowControl w:val="0"/>
         <w:numPr>
           <w:ilvl w:val="0"/>
           <w:numId w:val="4"/>
@@ -18654,6 +19273,7 @@
     <w:p>
       <w:pPr>
         <w:pStyle w:val="Prrafodelista"/>
+        <w:widowControl w:val="0"/>
         <w:numPr>
           <w:ilvl w:val="0"/>
           <w:numId w:val="4"/>
@@ -18706,6 +19326,7 @@
     </w:p>
     <w:p>
       <w:pPr>
+        <w:widowControl w:val="0"/>
         <w:ind w:left="360"/>
         <w:rPr>
           <w:rFonts w:cstheme="minorHAnsi"/>
@@ -18719,6 +19340,7 @@
     </w:p>
     <w:p>
       <w:pPr>
+        <w:widowControl w:val="0"/>
         <w:ind w:left="360"/>
         <w:rPr>
           <w:rFonts w:cstheme="minorHAnsi"/>
@@ -18732,6 +19354,7 @@
     </w:p>
     <w:p>
       <w:pPr>
+        <w:widowControl w:val="0"/>
         <w:ind w:left="360"/>
         <w:rPr>
           <w:rFonts w:cstheme="minorHAnsi"/>
@@ -18745,6 +19368,7 @@
     </w:p>
     <w:p>
       <w:pPr>
+        <w:widowControl w:val="0"/>
         <w:ind w:left="360"/>
         <w:rPr>
           <w:rFonts w:cstheme="minorHAnsi"/>
@@ -18786,6 +19410,7 @@
           </w:tcPr>
           <w:p>
             <w:pPr>
+              <w:widowControl w:val="0"/>
               <w:pBdr>
                 <w:bottom w:val="single" w:sz="12" w:space="1" w:color="806000" w:themeColor="accent4" w:themeShade="80"/>
               </w:pBdr>
@@ -18800,6 +19425,7 @@
           </w:p>
           <w:p>
             <w:pPr>
+              <w:widowControl w:val="0"/>
               <w:jc w:val="center"/>
               <w:rPr>
                 <w:rFonts w:ascii="Vivaldi" w:hAnsi="Vivaldi" w:cs="Arial"/>
@@ -18820,6 +19446,7 @@
           </w:p>
           <w:p>
             <w:pPr>
+              <w:widowControl w:val="0"/>
               <w:jc w:val="center"/>
               <w:rPr>
                 <w:rFonts w:ascii="Times New Roman" w:hAnsi="Times New Roman" w:cs="Times New Roman"/>
@@ -18847,6 +19474,7 @@
           </w:tcPr>
           <w:p>
             <w:pPr>
+              <w:widowControl w:val="0"/>
               <w:jc w:val="center"/>
               <w:rPr>
                 <w:rFonts w:ascii="Arial Narrow" w:hAnsi="Arial Narrow"/>
@@ -18863,6 +19491,7 @@
           </w:tcPr>
           <w:p>
             <w:pPr>
+              <w:widowControl w:val="0"/>
               <w:pBdr>
                 <w:bottom w:val="single" w:sz="12" w:space="1" w:color="806000" w:themeColor="accent4" w:themeShade="80"/>
               </w:pBdr>
@@ -18877,6 +19506,7 @@
           </w:p>
           <w:p>
             <w:pPr>
+              <w:widowControl w:val="0"/>
               <w:jc w:val="center"/>
               <w:rPr>
                 <w:rFonts w:ascii="Vivaldi" w:hAnsi="Vivaldi" w:cs="Arial"/>
@@ -18917,6 +19547,7 @@
           </w:p>
           <w:p>
             <w:pPr>
+              <w:widowControl w:val="0"/>
               <w:jc w:val="center"/>
               <w:rPr>
                 <w:rFonts w:ascii="Times New Roman" w:hAnsi="Times New Roman" w:cs="Times New Roman"/>
@@ -18963,6 +19594,7 @@
           </w:tcPr>
           <w:p>
             <w:pPr>
+              <w:widowControl w:val="0"/>
               <w:pBdr>
                 <w:bottom w:val="single" w:sz="12" w:space="1" w:color="806000" w:themeColor="accent4" w:themeShade="80"/>
               </w:pBdr>
@@ -18977,6 +19609,7 @@
           </w:p>
           <w:p>
             <w:pPr>
+              <w:widowControl w:val="0"/>
               <w:pBdr>
                 <w:bottom w:val="single" w:sz="12" w:space="1" w:color="806000" w:themeColor="accent4" w:themeShade="80"/>
               </w:pBdr>
@@ -18991,6 +19624,7 @@
           </w:p>
           <w:p>
             <w:pPr>
+              <w:widowControl w:val="0"/>
               <w:pBdr>
                 <w:bottom w:val="single" w:sz="12" w:space="1" w:color="806000" w:themeColor="accent4" w:themeShade="80"/>
               </w:pBdr>
@@ -19005,6 +19639,7 @@
           </w:p>
           <w:p>
             <w:pPr>
+              <w:widowControl w:val="0"/>
               <w:pBdr>
                 <w:bottom w:val="single" w:sz="12" w:space="1" w:color="806000" w:themeColor="accent4" w:themeShade="80"/>
               </w:pBdr>
@@ -19019,6 +19654,7 @@
           </w:p>
           <w:p>
             <w:pPr>
+              <w:widowControl w:val="0"/>
               <w:jc w:val="center"/>
               <w:rPr>
                 <w:rFonts w:ascii="Vivaldi" w:hAnsi="Vivaldi" w:cs="Arial"/>
@@ -19059,6 +19695,7 @@
           </w:p>
           <w:p>
             <w:pPr>
+              <w:widowControl w:val="0"/>
               <w:jc w:val="center"/>
               <w:rPr>
                 <w:rFonts w:ascii="Times New Roman" w:hAnsi="Times New Roman" w:cs="Times New Roman"/>
@@ -19105,6 +19742,7 @@
           </w:tcPr>
           <w:p>
             <w:pPr>
+              <w:widowControl w:val="0"/>
               <w:jc w:val="center"/>
               <w:rPr>
                 <w:rFonts w:ascii="Arial Narrow" w:hAnsi="Arial Narrow"/>
@@ -19127,6 +19765,7 @@
           </w:tcPr>
           <w:p>
             <w:pPr>
+              <w:widowControl w:val="0"/>
               <w:pBdr>
                 <w:bottom w:val="single" w:sz="12" w:space="1" w:color="806000" w:themeColor="accent4" w:themeShade="80"/>
               </w:pBdr>
@@ -19141,6 +19780,7 @@
           </w:p>
           <w:p>
             <w:pPr>
+              <w:widowControl w:val="0"/>
               <w:pBdr>
                 <w:bottom w:val="single" w:sz="12" w:space="1" w:color="806000" w:themeColor="accent4" w:themeShade="80"/>
               </w:pBdr>
@@ -19155,6 +19795,7 @@
           </w:p>
           <w:p>
             <w:pPr>
+              <w:widowControl w:val="0"/>
               <w:pBdr>
                 <w:bottom w:val="single" w:sz="12" w:space="1" w:color="806000" w:themeColor="accent4" w:themeShade="80"/>
               </w:pBdr>
@@ -19169,6 +19810,7 @@
           </w:p>
           <w:p>
             <w:pPr>
+              <w:widowControl w:val="0"/>
               <w:pBdr>
                 <w:bottom w:val="single" w:sz="12" w:space="1" w:color="806000" w:themeColor="accent4" w:themeShade="80"/>
               </w:pBdr>
@@ -19183,6 +19825,7 @@
           </w:p>
           <w:p>
             <w:pPr>
+              <w:widowControl w:val="0"/>
               <w:jc w:val="center"/>
               <w:rPr>
                 <w:rFonts w:ascii="Vivaldi" w:hAnsi="Vivaldi" w:cs="Arial"/>
@@ -19203,6 +19846,7 @@
           </w:p>
           <w:p>
             <w:pPr>
+              <w:widowControl w:val="0"/>
               <w:jc w:val="center"/>
               <w:rPr>
                 <w:rFonts w:ascii="Times New Roman" w:hAnsi="Times New Roman" w:cs="Times New Roman"/>
@@ -19229,6 +19873,7 @@
     <w:p>
       <w:pPr>
         <w:pStyle w:val="Prrafodelista"/>
+        <w:widowControl w:val="0"/>
         <w:spacing w:line="360" w:lineRule="auto"/>
         <w:rPr>
           <w:b/>
@@ -19241,6 +19886,7 @@
     </w:p>
     <w:p>
       <w:pPr>
+        <w:widowControl w:val="0"/>
         <w:rPr>
           <w:rFonts w:ascii="Calibri" w:hAnsi="Calibri" w:cs="Calibri"/>
           <w:b/>

</xml_diff>